<commit_message>
DO OSPF startup config
</commit_message>
<xml_diff>
--- a/jnciesproadmap/DO_OSPF_Enterprise_cRPD/DO_OSPF.docx
+++ b/jnciesproadmap/DO_OSPF_Enterprise_cRPD/DO_OSPF.docx
@@ -4,7 +4,7 @@
   <w:body>
     <w:p>
       <w:pPr>
-        <w:pStyle w:val="140"/>
+        <w:pStyle w:val="834"/>
         <w:pBdr/>
         <w:spacing/>
         <w:ind/>
@@ -17,7 +17,7 @@
     </w:p>
     <w:p>
       <w:pPr>
-        <w:pStyle w:val="141"/>
+        <w:pStyle w:val="835"/>
         <w:pBdr/>
         <w:spacing/>
         <w:ind/>
@@ -26,10 +26,6 @@
       <w:r>
         <w:t xml:space="preserve">Load Config</w:t>
       </w:r>
-      <w:r/>
-      <w:r/>
-      <w:r/>
-      <w:r/>
       <w:r/>
     </w:p>
     <w:tbl>
@@ -63,7 +59,7 @@
           </w:tcPr>
           <w:p>
             <w:pPr>
-              <w:pStyle w:val="1_18"/>
+              <w:pStyle w:val="897"/>
               <w:pBdr/>
               <w:bidi w:val="false"/>
               <w:spacing/>
@@ -96,10 +92,19 @@
                 <w:szCs w:val="20"/>
               </w:rPr>
             </w:r>
+            <w:r>
+              <w:rPr>
+                <w:rFonts w:ascii="Courier New" w:hAnsi="Courier New"/>
+                <w:b/>
+                <w:bCs/>
+                <w:sz w:val="20"/>
+                <w:szCs w:val="20"/>
+              </w:rPr>
+            </w:r>
           </w:p>
           <w:p>
             <w:pPr>
-              <w:pStyle w:val="1_18"/>
+              <w:pStyle w:val="897"/>
               <w:pBdr/>
               <w:bidi w:val="false"/>
               <w:spacing/>
@@ -132,6 +137,15 @@
                 <w:szCs w:val="20"/>
               </w:rPr>
             </w:r>
+            <w:r>
+              <w:rPr>
+                <w:rFonts w:ascii="Courier New" w:hAnsi="Courier New"/>
+                <w:b w:val="0"/>
+                <w:bCs w:val="0"/>
+                <w:sz w:val="20"/>
+                <w:szCs w:val="20"/>
+              </w:rPr>
+            </w:r>
           </w:p>
         </w:tc>
       </w:tr>
@@ -145,11 +159,10 @@
       </w:pPr>
       <w:r/>
       <w:r/>
-      <w:r/>
     </w:p>
     <w:p>
       <w:pPr>
-        <w:pStyle w:val="141"/>
+        <w:pStyle w:val="835"/>
         <w:pBdr/>
         <w:spacing/>
         <w:ind/>
@@ -162,7 +175,7 @@
     </w:p>
     <w:p>
       <w:pPr>
-        <w:pStyle w:val="668"/>
+        <w:pStyle w:val="896"/>
         <w:numPr>
           <w:ilvl w:val="0"/>
           <w:numId w:val="2"/>
@@ -209,7 +222,7 @@
     </w:p>
     <w:p>
       <w:pPr>
-        <w:pStyle w:val="668"/>
+        <w:pStyle w:val="896"/>
         <w:numPr>
           <w:ilvl w:val="0"/>
           <w:numId w:val="2"/>
@@ -219,7 +232,6 @@
         <w:ind/>
         <w:rPr/>
       </w:pPr>
-      <w:r/>
       <w:r>
         <w:t xml:space="preserve">Enable OSPF </w:t>
       </w:r>
@@ -244,11 +256,10 @@
         <w:t xml:space="preserve"> link.</w:t>
       </w:r>
       <w:r/>
-      <w:r/>
     </w:p>
     <w:p>
       <w:pPr>
-        <w:pStyle w:val="668"/>
+        <w:pStyle w:val="896"/>
         <w:numPr>
           <w:ilvl w:val="0"/>
           <w:numId w:val="2"/>
@@ -258,7 +269,6 @@
         <w:ind/>
         <w:rPr/>
       </w:pPr>
-      <w:r/>
       <w:r>
         <w:t xml:space="preserve">Keep both loopbacks advertised in Area 0 but prevent OSPF adjacency attempts</w:t>
       </w:r>
@@ -266,11 +276,10 @@
         <w:t xml:space="preserve"> on loopback interfaces by configuring them as passive.</w:t>
       </w:r>
       <w:r/>
-      <w:r/>
     </w:p>
     <w:p>
       <w:pPr>
-        <w:pStyle w:val="668"/>
+        <w:pStyle w:val="896"/>
         <w:numPr>
           <w:ilvl w:val="0"/>
           <w:numId w:val="2"/>
@@ -287,11 +296,10 @@
         <w:t xml:space="preserve"> 100, then commit the configuration.</w:t>
       </w:r>
       <w:r/>
-      <w:r/>
     </w:p>
     <w:p>
       <w:pPr>
-        <w:pStyle w:val="668"/>
+        <w:pStyle w:val="896"/>
         <w:numPr>
           <w:ilvl w:val="0"/>
           <w:numId w:val="2"/>
@@ -308,7 +316,7 @@
     </w:p>
     <w:p>
       <w:pPr>
-        <w:pStyle w:val="141"/>
+        <w:pStyle w:val="835"/>
         <w:pBdr/>
         <w:spacing/>
         <w:ind/>
@@ -324,7 +332,7 @@
     </w:p>
     <w:p>
       <w:pPr>
-        <w:pStyle w:val="668"/>
+        <w:pStyle w:val="896"/>
         <w:numPr>
           <w:ilvl w:val="0"/>
           <w:numId w:val="3"/>
@@ -355,7 +363,7 @@
     </w:p>
     <w:p>
       <w:pPr>
-        <w:pStyle w:val="668"/>
+        <w:pStyle w:val="896"/>
         <w:numPr>
           <w:ilvl w:val="0"/>
           <w:numId w:val="3"/>
@@ -386,7 +394,7 @@
     </w:p>
     <w:p>
       <w:pPr>
-        <w:pStyle w:val="668"/>
+        <w:pStyle w:val="896"/>
         <w:numPr>
           <w:ilvl w:val="0"/>
           <w:numId w:val="3"/>
@@ -417,7 +425,7 @@
     </w:p>
     <w:p>
       <w:pPr>
-        <w:pStyle w:val="668"/>
+        <w:pStyle w:val="896"/>
         <w:numPr>
           <w:ilvl w:val="0"/>
           <w:numId w:val="3"/>
@@ -454,7 +462,7 @@
     </w:p>
     <w:p>
       <w:pPr>
-        <w:pStyle w:val="668"/>
+        <w:pStyle w:val="896"/>
         <w:numPr>
           <w:ilvl w:val="0"/>
           <w:numId w:val="3"/>
@@ -491,7 +499,7 @@
     </w:p>
     <w:p>
       <w:pPr>
-        <w:pStyle w:val="668"/>
+        <w:pStyle w:val="896"/>
         <w:numPr>
           <w:ilvl w:val="0"/>
           <w:numId w:val="3"/>
@@ -522,7 +530,7 @@
     </w:p>
     <w:p>
       <w:pPr>
-        <w:pStyle w:val="141"/>
+        <w:pStyle w:val="835"/>
         <w:pBdr/>
         <w:spacing/>
         <w:ind/>
@@ -547,6 +555,303 @@
         </w:rPr>
       </w:r>
     </w:p>
+    <w:p>
+      <w:pPr>
+        <w:pStyle w:val="834"/>
+        <w:pBdr/>
+        <w:spacing/>
+        <w:ind/>
+        <w:rPr/>
+      </w:pPr>
+      <w:r>
+        <w:t xml:space="preserve">Lab 005 Multi Domain</w:t>
+      </w:r>
+      <w:r/>
+    </w:p>
+    <w:p>
+      <w:pPr>
+        <w:pStyle w:val="835"/>
+        <w:pBdr/>
+        <w:spacing/>
+        <w:ind/>
+        <w:rPr/>
+      </w:pPr>
+      <w:r>
+        <w:t xml:space="preserve">Load Config</w:t>
+      </w:r>
+      <w:r/>
+    </w:p>
+    <w:tbl>
+      <w:tblPr>
+        <w:tblInd w:w="-5" w:type="dxa"/>
+        <w:tblW w:w="5000" w:type="pct"/>
+        <w:tblCellMar>
+          <w:left w:w="55" w:type="dxa"/>
+          <w:top w:w="55" w:type="dxa"/>
+          <w:right w:w="55" w:type="dxa"/>
+          <w:bottom w:w="55" w:type="dxa"/>
+        </w:tblCellMar>
+        <w:tblBorders/>
+        <w:tblLayout w:type="fixed"/>
+        <w:tblLook w:val="04A0" w:firstRow="1" w:lastRow="0" w:firstColumn="1" w:lastColumn="0" w:noHBand="0" w:noVBand="1"/>
+      </w:tblPr>
+      <w:tblGrid>
+        <w:gridCol w:w="9972"/>
+      </w:tblGrid>
+      <w:tr>
+        <w:trPr/>
+        <w:tc>
+          <w:tcPr>
+            <w:tcBorders>
+              <w:top w:val="single" w:color="000000" w:sz="4" w:space="0"/>
+              <w:left w:val="single" w:color="000000" w:sz="4" w:space="0"/>
+              <w:bottom w:val="single" w:color="000000" w:sz="4" w:space="0"/>
+              <w:right w:val="single" w:color="000000" w:sz="4" w:space="0"/>
+            </w:tcBorders>
+            <w:tcW w:w="9972" w:type="dxa"/>
+          </w:tcPr>
+          <w:p>
+            <w:pPr>
+              <w:pStyle w:val="897"/>
+              <w:pBdr/>
+              <w:bidi w:val="false"/>
+              <w:spacing/>
+              <w:ind/>
+              <w:jc w:val="left"/>
+              <w:rPr>
+                <w:rFonts w:ascii="Courier New" w:hAnsi="Courier New"/>
+                <w:b/>
+                <w:bCs/>
+                <w:sz w:val="20"/>
+                <w:szCs w:val="20"/>
+              </w:rPr>
+            </w:pPr>
+            <w:r>
+              <w:rPr>
+                <w:rFonts w:ascii="Courier New" w:hAnsi="Courier New"/>
+                <w:b/>
+                <w:bCs/>
+                <w:sz w:val="20"/>
+                <w:szCs w:val="20"/>
+              </w:rPr>
+              <w:t xml:space="preserve"># crpd</w:t>
+            </w:r>
+            <w:r>
+              <w:rPr>
+                <w:rFonts w:ascii="Courier New" w:hAnsi="Courier New"/>
+                <w:b/>
+                <w:bCs/>
+                <w:sz w:val="20"/>
+                <w:szCs w:val="20"/>
+              </w:rPr>
+            </w:r>
+            <w:r>
+              <w:rPr>
+                <w:rFonts w:ascii="Courier New" w:hAnsi="Courier New"/>
+                <w:b/>
+                <w:bCs/>
+                <w:sz w:val="20"/>
+                <w:szCs w:val="20"/>
+              </w:rPr>
+            </w:r>
+          </w:p>
+          <w:p>
+            <w:pPr>
+              <w:pStyle w:val="897"/>
+              <w:pBdr/>
+              <w:bidi w:val="false"/>
+              <w:spacing/>
+              <w:ind/>
+              <w:jc w:val="left"/>
+              <w:rPr>
+                <w:rFonts w:ascii="Courier New" w:hAnsi="Courier New"/>
+                <w:b w:val="0"/>
+                <w:bCs w:val="0"/>
+                <w:sz w:val="20"/>
+                <w:szCs w:val="20"/>
+                <w:highlight w:val="none"/>
+              </w:rPr>
+            </w:pPr>
+            <w:r>
+              <w:rPr>
+                <w:rFonts w:ascii="Courier New" w:hAnsi="Courier New"/>
+                <w:b w:val="0"/>
+                <w:bCs w:val="0"/>
+                <w:sz w:val="20"/>
+                <w:szCs w:val="20"/>
+              </w:rPr>
+              <w:t xml:space="preserve">conf</w:t>
+            </w:r>
+            <w:r>
+              <w:rPr>
+                <w:rFonts w:ascii="Courier New" w:hAnsi="Courier New"/>
+                <w:b w:val="0"/>
+                <w:bCs w:val="0"/>
+                <w:sz w:val="20"/>
+                <w:szCs w:val="20"/>
+                <w:highlight w:val="none"/>
+              </w:rPr>
+            </w:r>
+          </w:p>
+          <w:p>
+            <w:pPr>
+              <w:pStyle w:val="897"/>
+              <w:pBdr/>
+              <w:bidi w:val="false"/>
+              <w:spacing/>
+              <w:ind/>
+              <w:jc w:val="left"/>
+              <w:rPr>
+                <w:rFonts w:ascii="Courier New" w:hAnsi="Courier New"/>
+                <w:b w:val="0"/>
+                <w:bCs w:val="0"/>
+                <w:sz w:val="20"/>
+                <w:szCs w:val="20"/>
+                <w:highlight w:val="none"/>
+              </w:rPr>
+            </w:pPr>
+            <w:r>
+              <w:rPr>
+                <w:rFonts w:ascii="Courier New" w:hAnsi="Courier New"/>
+                <w:b w:val="0"/>
+                <w:bCs w:val="0"/>
+                <w:sz w:val="20"/>
+                <w:szCs w:val="20"/>
+                <w:highlight w:val="none"/>
+              </w:rPr>
+            </w:r>
+            <w:r>
+              <w:rPr>
+                <w:rFonts w:ascii="Courier New" w:hAnsi="Courier New"/>
+                <w:b w:val="0"/>
+                <w:bCs w:val="0"/>
+                <w:sz w:val="20"/>
+                <w:szCs w:val="20"/>
+                <w:highlight w:val="none"/>
+              </w:rPr>
+            </w:r>
+            <w:r>
+              <w:rPr>
+                <w:rFonts w:ascii="Courier New" w:hAnsi="Courier New"/>
+                <w:b w:val="0"/>
+                <w:bCs w:val="0"/>
+                <w:sz w:val="20"/>
+                <w:szCs w:val="20"/>
+                <w:highlight w:val="none"/>
+              </w:rPr>
+            </w:r>
+          </w:p>
+          <w:p>
+            <w:pPr>
+              <w:pStyle w:val="897"/>
+              <w:pBdr/>
+              <w:bidi w:val="false"/>
+              <w:spacing/>
+              <w:ind/>
+              <w:jc w:val="left"/>
+              <w:rPr>
+                <w:rFonts w:ascii="Courier New" w:hAnsi="Courier New"/>
+                <w:b w:val="0"/>
+                <w:bCs w:val="0"/>
+                <w:sz w:val="20"/>
+                <w:szCs w:val="20"/>
+              </w:rPr>
+            </w:pPr>
+            <w:r>
+              <w:rPr>
+                <w:rFonts w:ascii="Courier New" w:hAnsi="Courier New"/>
+                <w:b w:val="0"/>
+                <w:bCs w:val="0"/>
+                <w:sz w:val="20"/>
+                <w:szCs w:val="20"/>
+                <w:highlight w:val="none"/>
+              </w:rPr>
+              <w:t xml:space="preserve">load replace </w:t>
+            </w:r>
+            <w:r>
+              <w:rPr>
+                <w:rFonts w:ascii="Courier New" w:hAnsi="Courier New"/>
+                <w:b w:val="0"/>
+                <w:bCs w:val="0"/>
+                <w:sz w:val="20"/>
+                <w:szCs w:val="20"/>
+                <w:highlight w:val="none"/>
+              </w:rPr>
+              <w:t xml:space="preserve">/lab-configs/</w:t>
+            </w:r>
+            <w:r>
+              <w:rPr>
+                <w:rFonts w:ascii="Courier New" w:hAnsi="Courier New"/>
+                <w:b/>
+                <w:bCs/>
+                <w:sz w:val="20"/>
+                <w:szCs w:val="20"/>
+                <w:highlight w:val="none"/>
+              </w:rPr>
+              <w:t xml:space="preserve">ospf.multidomain.conf</w:t>
+            </w:r>
+            <w:r>
+              <w:rPr>
+                <w:rFonts w:ascii="Courier New" w:hAnsi="Courier New"/>
+                <w:b w:val="0"/>
+                <w:bCs w:val="0"/>
+                <w:sz w:val="20"/>
+                <w:szCs w:val="20"/>
+                <w:highlight w:val="none"/>
+              </w:rPr>
+            </w:r>
+            <w:r>
+              <w:rPr>
+                <w:rFonts w:ascii="Courier New" w:hAnsi="Courier New"/>
+                <w:b w:val="0"/>
+                <w:bCs w:val="0"/>
+                <w:sz w:val="20"/>
+                <w:szCs w:val="20"/>
+                <w:highlight w:val="none"/>
+              </w:rPr>
+            </w:r>
+          </w:p>
+        </w:tc>
+      </w:tr>
+    </w:tbl>
+    <w:p>
+      <w:pPr>
+        <w:pBdr/>
+        <w:spacing/>
+        <w:ind/>
+        <w:rPr/>
+      </w:pPr>
+      <w:r/>
+      <w:r/>
+      <w:r/>
+    </w:p>
+    <w:p>
+      <w:pPr>
+        <w:pBdr/>
+        <w:spacing/>
+        <w:ind/>
+        <w:rPr/>
+      </w:pPr>
+      <w:r>
+        <w:t xml:space="preserve">Start from Task 4 </w:t>
+      </w:r>
+      <w:r>
+        <w:t xml:space="preserve">BUILD OSPF IN AS 65002</w:t>
+      </w:r>
+      <w:r/>
+      <w:r/>
+    </w:p>
+    <w:p>
+      <w:pPr>
+        <w:pBdr/>
+        <w:spacing/>
+        <w:ind/>
+        <w:rPr/>
+      </w:pPr>
+      <w:r/>
+      <w:r/>
+      <w:r/>
+    </w:p>
     <w:sectPr>
       <w:footnotePr/>
       <w:endnotePr/>
@@ -569,7 +874,6 @@
         <w:ind/>
         <w:rPr/>
       </w:pPr>
-      <w:r/>
       <w:r>
         <w:separator/>
       </w:r>
@@ -584,7 +888,6 @@
         <w:ind/>
         <w:rPr/>
       </w:pPr>
-      <w:r/>
       <w:r>
         <w:continuationSeparator/>
       </w:r>
@@ -604,7 +907,6 @@
         <w:ind/>
         <w:rPr/>
       </w:pPr>
-      <w:r/>
       <w:r>
         <w:separator/>
       </w:r>
@@ -619,7 +921,6 @@
         <w:ind/>
         <w:rPr/>
       </w:pPr>
-      <w:r/>
       <w:r>
         <w:continuationSeparator/>
       </w:r>
@@ -1206,9 +1507,9 @@
     <w:lsdException w:name="Bibliography" w:uiPriority="37"/>
     <w:lsdException w:name="TOC Heading" w:uiPriority="39" w:qFormat="1"/>
   </w:latentStyles>
-  <w:style w:type="table" w:styleId="12">
+  <w:style w:type="table" w:styleId="707">
     <w:name w:val="Table Grid"/>
-    <w:basedOn w:val="665"/>
+    <w:basedOn w:val="893"/>
     <w:uiPriority w:val="59"/>
     <w:pPr>
       <w:pBdr/>
@@ -1405,9 +1706,9 @@
       </w:tcPr>
     </w:tblStylePr>
   </w:style>
-  <w:style w:type="table" w:styleId="13">
+  <w:style w:type="table" w:styleId="708">
     <w:name w:val="Table Grid Light"/>
-    <w:basedOn w:val="665"/>
+    <w:basedOn w:val="893"/>
     <w:uiPriority w:val="59"/>
     <w:pPr>
       <w:pBdr/>
@@ -1604,9 +1905,9 @@
       </w:tcPr>
     </w:tblStylePr>
   </w:style>
-  <w:style w:type="table" w:styleId="14">
+  <w:style w:type="table" w:styleId="709">
     <w:name w:val="Plain Table 1"/>
-    <w:basedOn w:val="665"/>
+    <w:basedOn w:val="893"/>
     <w:uiPriority w:val="59"/>
     <w:pPr>
       <w:pBdr/>
@@ -1829,9 +2130,9 @@
       </w:tcPr>
     </w:tblStylePr>
   </w:style>
-  <w:style w:type="table" w:styleId="15">
+  <w:style w:type="table" w:styleId="710">
     <w:name w:val="Plain Table 2"/>
-    <w:basedOn w:val="665"/>
+    <w:basedOn w:val="893"/>
     <w:uiPriority w:val="59"/>
     <w:pPr>
       <w:pBdr/>
@@ -2062,9 +2363,9 @@
       </w:tcPr>
     </w:tblStylePr>
   </w:style>
-  <w:style w:type="table" w:styleId="16">
+  <w:style w:type="table" w:styleId="711">
     <w:name w:val="Plain Table 3"/>
-    <w:basedOn w:val="665"/>
+    <w:basedOn w:val="893"/>
     <w:uiPriority w:val="99"/>
     <w:pPr>
       <w:pBdr/>
@@ -2292,9 +2593,9 @@
       </w:tcPr>
     </w:tblStylePr>
   </w:style>
-  <w:style w:type="table" w:styleId="17">
+  <w:style w:type="table" w:styleId="712">
     <w:name w:val="Plain Table 4"/>
-    <w:basedOn w:val="665"/>
+    <w:basedOn w:val="893"/>
     <w:uiPriority w:val="99"/>
     <w:pPr>
       <w:pBdr/>
@@ -2508,9 +2809,9 @@
       </w:tcPr>
     </w:tblStylePr>
   </w:style>
-  <w:style w:type="table" w:styleId="18">
+  <w:style w:type="table" w:styleId="713">
     <w:name w:val="Plain Table 5"/>
-    <w:basedOn w:val="665"/>
+    <w:basedOn w:val="893"/>
     <w:uiPriority w:val="99"/>
     <w:pPr>
       <w:pBdr/>
@@ -2741,9 +3042,9 @@
       </w:tcPr>
     </w:tblStylePr>
   </w:style>
-  <w:style w:type="table" w:styleId="19">
+  <w:style w:type="table" w:styleId="714">
     <w:name w:val="Grid Table 1 Light"/>
-    <w:basedOn w:val="665"/>
+    <w:basedOn w:val="893"/>
     <w:uiPriority w:val="99"/>
     <w:pPr>
       <w:pBdr/>
@@ -2964,9 +3265,9 @@
       </w:tcPr>
     </w:tblStylePr>
   </w:style>
-  <w:style w:type="table" w:styleId="20">
+  <w:style w:type="table" w:styleId="715">
     <w:name w:val="Grid Table 1 Light - Accent 1"/>
-    <w:basedOn w:val="665"/>
+    <w:basedOn w:val="893"/>
     <w:uiPriority w:val="99"/>
     <w:pPr>
       <w:pBdr/>
@@ -3187,9 +3488,9 @@
       </w:tcPr>
     </w:tblStylePr>
   </w:style>
-  <w:style w:type="table" w:styleId="21">
+  <w:style w:type="table" w:styleId="716">
     <w:name w:val="Grid Table 1 Light - Accent 2"/>
-    <w:basedOn w:val="665"/>
+    <w:basedOn w:val="893"/>
     <w:uiPriority w:val="99"/>
     <w:pPr>
       <w:pBdr/>
@@ -3410,9 +3711,9 @@
       </w:tcPr>
     </w:tblStylePr>
   </w:style>
-  <w:style w:type="table" w:styleId="22">
+  <w:style w:type="table" w:styleId="717">
     <w:name w:val="Grid Table 1 Light - Accent 3"/>
-    <w:basedOn w:val="665"/>
+    <w:basedOn w:val="893"/>
     <w:uiPriority w:val="99"/>
     <w:pPr>
       <w:pBdr/>
@@ -3633,9 +3934,9 @@
       </w:tcPr>
     </w:tblStylePr>
   </w:style>
-  <w:style w:type="table" w:styleId="23">
+  <w:style w:type="table" w:styleId="718">
     <w:name w:val="Grid Table 1 Light - Accent 4"/>
-    <w:basedOn w:val="665"/>
+    <w:basedOn w:val="893"/>
     <w:uiPriority w:val="99"/>
     <w:pPr>
       <w:pBdr/>
@@ -3856,9 +4157,9 @@
       </w:tcPr>
     </w:tblStylePr>
   </w:style>
-  <w:style w:type="table" w:styleId="24">
+  <w:style w:type="table" w:styleId="719">
     <w:name w:val="Grid Table 1 Light - Accent 5"/>
-    <w:basedOn w:val="665"/>
+    <w:basedOn w:val="893"/>
     <w:uiPriority w:val="99"/>
     <w:pPr>
       <w:pBdr/>
@@ -4079,9 +4380,9 @@
       </w:tcPr>
     </w:tblStylePr>
   </w:style>
-  <w:style w:type="table" w:styleId="25">
+  <w:style w:type="table" w:styleId="720">
     <w:name w:val="Grid Table 1 Light - Accent 6"/>
-    <w:basedOn w:val="665"/>
+    <w:basedOn w:val="893"/>
     <w:uiPriority w:val="99"/>
     <w:pPr>
       <w:pBdr/>
@@ -4302,9 +4603,9 @@
       </w:tcPr>
     </w:tblStylePr>
   </w:style>
-  <w:style w:type="table" w:styleId="26">
+  <w:style w:type="table" w:styleId="721">
     <w:name w:val="Grid Table 2"/>
-    <w:basedOn w:val="665"/>
+    <w:basedOn w:val="893"/>
     <w:uiPriority w:val="99"/>
     <w:pPr>
       <w:pBdr/>
@@ -4534,9 +4835,9 @@
       </w:tcPr>
     </w:tblStylePr>
   </w:style>
-  <w:style w:type="table" w:styleId="27">
+  <w:style w:type="table" w:styleId="722">
     <w:name w:val="Grid Table 2 - Accent 1"/>
-    <w:basedOn w:val="665"/>
+    <w:basedOn w:val="893"/>
     <w:uiPriority w:val="99"/>
     <w:pPr>
       <w:pBdr/>
@@ -4766,9 +5067,9 @@
       </w:tcPr>
     </w:tblStylePr>
   </w:style>
-  <w:style w:type="table" w:styleId="28">
+  <w:style w:type="table" w:styleId="723">
     <w:name w:val="Grid Table 2 - Accent 2"/>
-    <w:basedOn w:val="665"/>
+    <w:basedOn w:val="893"/>
     <w:uiPriority w:val="99"/>
     <w:pPr>
       <w:pBdr/>
@@ -4998,9 +5299,9 @@
       </w:tcPr>
     </w:tblStylePr>
   </w:style>
-  <w:style w:type="table" w:styleId="29">
+  <w:style w:type="table" w:styleId="724">
     <w:name w:val="Grid Table 2 - Accent 3"/>
-    <w:basedOn w:val="665"/>
+    <w:basedOn w:val="893"/>
     <w:uiPriority w:val="99"/>
     <w:pPr>
       <w:pBdr/>
@@ -5230,9 +5531,9 @@
       </w:tcPr>
     </w:tblStylePr>
   </w:style>
-  <w:style w:type="table" w:styleId="30">
+  <w:style w:type="table" w:styleId="725">
     <w:name w:val="Grid Table 2 - Accent 4"/>
-    <w:basedOn w:val="665"/>
+    <w:basedOn w:val="893"/>
     <w:uiPriority w:val="99"/>
     <w:pPr>
       <w:pBdr/>
@@ -5462,9 +5763,9 @@
       </w:tcPr>
     </w:tblStylePr>
   </w:style>
-  <w:style w:type="table" w:styleId="31">
+  <w:style w:type="table" w:styleId="726">
     <w:name w:val="Grid Table 2 - Accent 5"/>
-    <w:basedOn w:val="665"/>
+    <w:basedOn w:val="893"/>
     <w:uiPriority w:val="99"/>
     <w:pPr>
       <w:pBdr/>
@@ -5694,9 +5995,9 @@
       </w:tcPr>
     </w:tblStylePr>
   </w:style>
-  <w:style w:type="table" w:styleId="32">
+  <w:style w:type="table" w:styleId="727">
     <w:name w:val="Grid Table 2 - Accent 6"/>
-    <w:basedOn w:val="665"/>
+    <w:basedOn w:val="893"/>
     <w:uiPriority w:val="99"/>
     <w:pPr>
       <w:pBdr/>
@@ -5926,9 +6227,9 @@
       </w:tcPr>
     </w:tblStylePr>
   </w:style>
-  <w:style w:type="table" w:styleId="33">
+  <w:style w:type="table" w:styleId="728">
     <w:name w:val="Grid Table 3"/>
-    <w:basedOn w:val="665"/>
+    <w:basedOn w:val="893"/>
     <w:uiPriority w:val="99"/>
     <w:pPr>
       <w:pBdr/>
@@ -6027,29 +6328,6 @@
         <w:tblBorders/>
       </w:tblPr>
       <w:tcPr>
-        <w:shd w:color="ffffff"/>
-        <w:tcBorders>
-          <w:top w:val="none" w:color="000000" w:sz="4" w:space="0"/>
-          <w:left w:val="none" w:color="000000" w:sz="4" w:space="0"/>
-          <w:bottom w:val="none" w:color="000000" w:sz="4" w:space="0"/>
-          <w:right w:val="none" w:color="000000" w:sz="4" w:space="0"/>
-        </w:tcBorders>
-      </w:tcPr>
-    </w:tblStylePr>
-    <w:tblStylePr w:type="firstRow">
-      <w:rPr>
-        <w:b/>
-        <w:color w:val="404040"/>
-      </w:rPr>
-      <w:pPr>
-        <w:pBdr/>
-        <w:spacing/>
-        <w:ind/>
-      </w:pPr>
-      <w:tblPr>
-        <w:tblBorders/>
-      </w:tblPr>
-      <w:tcPr>
         <w:shd w:val="clear" w:color="ffffff"/>
         <w:tcBorders>
           <w:top w:val="none" w:color="000000" w:sz="4" w:space="0"/>
@@ -6059,30 +6337,7 @@
         </w:tcBorders>
       </w:tcPr>
     </w:tblStylePr>
-    <w:tblStylePr w:type="lastCol">
-      <w:rPr>
-        <w:i/>
-        <w:color w:val="404040"/>
-      </w:rPr>
-      <w:pPr>
-        <w:pBdr/>
-        <w:spacing/>
-        <w:ind/>
-      </w:pPr>
-      <w:tblPr>
-        <w:tblBorders/>
-      </w:tblPr>
-      <w:tcPr>
-        <w:shd w:color="ffffff"/>
-        <w:tcBorders>
-          <w:top w:val="none" w:color="000000" w:sz="4" w:space="0"/>
-          <w:left w:val="none" w:color="000000" w:sz="4" w:space="0"/>
-          <w:bottom w:val="none" w:color="000000" w:sz="4" w:space="0"/>
-          <w:right w:val="none" w:color="000000" w:sz="4" w:space="0"/>
-        </w:tcBorders>
-      </w:tcPr>
-    </w:tblStylePr>
-    <w:tblStylePr w:type="lastRow">
+    <w:tblStylePr w:type="firstRow">
       <w:rPr>
         <w:b/>
         <w:color w:val="404040"/>
@@ -6105,6 +6360,52 @@
         </w:tcBorders>
       </w:tcPr>
     </w:tblStylePr>
+    <w:tblStylePr w:type="lastCol">
+      <w:rPr>
+        <w:i/>
+        <w:color w:val="404040"/>
+      </w:rPr>
+      <w:pPr>
+        <w:pBdr/>
+        <w:spacing/>
+        <w:ind/>
+      </w:pPr>
+      <w:tblPr>
+        <w:tblBorders/>
+      </w:tblPr>
+      <w:tcPr>
+        <w:shd w:val="clear" w:color="ffffff"/>
+        <w:tcBorders>
+          <w:top w:val="none" w:color="000000" w:sz="4" w:space="0"/>
+          <w:left w:val="none" w:color="000000" w:sz="4" w:space="0"/>
+          <w:bottom w:val="none" w:color="000000" w:sz="4" w:space="0"/>
+          <w:right w:val="none" w:color="000000" w:sz="4" w:space="0"/>
+        </w:tcBorders>
+      </w:tcPr>
+    </w:tblStylePr>
+    <w:tblStylePr w:type="lastRow">
+      <w:rPr>
+        <w:b/>
+        <w:color w:val="404040"/>
+      </w:rPr>
+      <w:pPr>
+        <w:pBdr/>
+        <w:spacing/>
+        <w:ind/>
+      </w:pPr>
+      <w:tblPr>
+        <w:tblBorders/>
+      </w:tblPr>
+      <w:tcPr>
+        <w:shd w:val="clear" w:color="ffffff"/>
+        <w:tcBorders>
+          <w:top w:val="none" w:color="000000" w:sz="4" w:space="0"/>
+          <w:left w:val="none" w:color="000000" w:sz="4" w:space="0"/>
+          <w:bottom w:val="none" w:color="000000" w:sz="4" w:space="0"/>
+          <w:right w:val="none" w:color="000000" w:sz="4" w:space="0"/>
+        </w:tcBorders>
+      </w:tcPr>
+    </w:tblStylePr>
     <w:tblStylePr w:type="nwCell">
       <w:pPr>
         <w:pBdr/>
@@ -6171,9 +6472,9 @@
       </w:tcPr>
     </w:tblStylePr>
   </w:style>
-  <w:style w:type="table" w:styleId="34">
+  <w:style w:type="table" w:styleId="729">
     <w:name w:val="Grid Table 3 - Accent 1"/>
-    <w:basedOn w:val="665"/>
+    <w:basedOn w:val="893"/>
     <w:uiPriority w:val="99"/>
     <w:pPr>
       <w:pBdr/>
@@ -6272,29 +6573,6 @@
         <w:tblBorders/>
       </w:tblPr>
       <w:tcPr>
-        <w:shd w:color="ffffff"/>
-        <w:tcBorders>
-          <w:top w:val="none" w:color="000000" w:sz="4" w:space="0"/>
-          <w:left w:val="none" w:color="000000" w:sz="4" w:space="0"/>
-          <w:bottom w:val="none" w:color="000000" w:sz="4" w:space="0"/>
-          <w:right w:val="none" w:color="000000" w:sz="4" w:space="0"/>
-        </w:tcBorders>
-      </w:tcPr>
-    </w:tblStylePr>
-    <w:tblStylePr w:type="firstRow">
-      <w:rPr>
-        <w:b/>
-        <w:color w:val="404040"/>
-      </w:rPr>
-      <w:pPr>
-        <w:pBdr/>
-        <w:spacing/>
-        <w:ind/>
-      </w:pPr>
-      <w:tblPr>
-        <w:tblBorders/>
-      </w:tblPr>
-      <w:tcPr>
         <w:shd w:val="clear" w:color="ffffff"/>
         <w:tcBorders>
           <w:top w:val="none" w:color="000000" w:sz="4" w:space="0"/>
@@ -6304,30 +6582,7 @@
         </w:tcBorders>
       </w:tcPr>
     </w:tblStylePr>
-    <w:tblStylePr w:type="lastCol">
-      <w:rPr>
-        <w:i/>
-        <w:color w:val="404040"/>
-      </w:rPr>
-      <w:pPr>
-        <w:pBdr/>
-        <w:spacing/>
-        <w:ind/>
-      </w:pPr>
-      <w:tblPr>
-        <w:tblBorders/>
-      </w:tblPr>
-      <w:tcPr>
-        <w:shd w:color="ffffff"/>
-        <w:tcBorders>
-          <w:top w:val="none" w:color="000000" w:sz="4" w:space="0"/>
-          <w:left w:val="none" w:color="000000" w:sz="4" w:space="0"/>
-          <w:bottom w:val="none" w:color="000000" w:sz="4" w:space="0"/>
-          <w:right w:val="none" w:color="000000" w:sz="4" w:space="0"/>
-        </w:tcBorders>
-      </w:tcPr>
-    </w:tblStylePr>
-    <w:tblStylePr w:type="lastRow">
+    <w:tblStylePr w:type="firstRow">
       <w:rPr>
         <w:b/>
         <w:color w:val="404040"/>
@@ -6350,6 +6605,52 @@
         </w:tcBorders>
       </w:tcPr>
     </w:tblStylePr>
+    <w:tblStylePr w:type="lastCol">
+      <w:rPr>
+        <w:i/>
+        <w:color w:val="404040"/>
+      </w:rPr>
+      <w:pPr>
+        <w:pBdr/>
+        <w:spacing/>
+        <w:ind/>
+      </w:pPr>
+      <w:tblPr>
+        <w:tblBorders/>
+      </w:tblPr>
+      <w:tcPr>
+        <w:shd w:val="clear" w:color="ffffff"/>
+        <w:tcBorders>
+          <w:top w:val="none" w:color="000000" w:sz="4" w:space="0"/>
+          <w:left w:val="none" w:color="000000" w:sz="4" w:space="0"/>
+          <w:bottom w:val="none" w:color="000000" w:sz="4" w:space="0"/>
+          <w:right w:val="none" w:color="000000" w:sz="4" w:space="0"/>
+        </w:tcBorders>
+      </w:tcPr>
+    </w:tblStylePr>
+    <w:tblStylePr w:type="lastRow">
+      <w:rPr>
+        <w:b/>
+        <w:color w:val="404040"/>
+      </w:rPr>
+      <w:pPr>
+        <w:pBdr/>
+        <w:spacing/>
+        <w:ind/>
+      </w:pPr>
+      <w:tblPr>
+        <w:tblBorders/>
+      </w:tblPr>
+      <w:tcPr>
+        <w:shd w:val="clear" w:color="ffffff"/>
+        <w:tcBorders>
+          <w:top w:val="none" w:color="000000" w:sz="4" w:space="0"/>
+          <w:left w:val="none" w:color="000000" w:sz="4" w:space="0"/>
+          <w:bottom w:val="none" w:color="000000" w:sz="4" w:space="0"/>
+          <w:right w:val="none" w:color="000000" w:sz="4" w:space="0"/>
+        </w:tcBorders>
+      </w:tcPr>
+    </w:tblStylePr>
     <w:tblStylePr w:type="nwCell">
       <w:pPr>
         <w:pBdr/>
@@ -6416,9 +6717,9 @@
       </w:tcPr>
     </w:tblStylePr>
   </w:style>
-  <w:style w:type="table" w:styleId="35">
+  <w:style w:type="table" w:styleId="730">
     <w:name w:val="Grid Table 3 - Accent 2"/>
-    <w:basedOn w:val="665"/>
+    <w:basedOn w:val="893"/>
     <w:uiPriority w:val="99"/>
     <w:pPr>
       <w:pBdr/>
@@ -6517,29 +6818,6 @@
         <w:tblBorders/>
       </w:tblPr>
       <w:tcPr>
-        <w:shd w:color="ffffff"/>
-        <w:tcBorders>
-          <w:top w:val="none" w:color="000000" w:sz="4" w:space="0"/>
-          <w:left w:val="none" w:color="000000" w:sz="4" w:space="0"/>
-          <w:bottom w:val="none" w:color="000000" w:sz="4" w:space="0"/>
-          <w:right w:val="none" w:color="000000" w:sz="4" w:space="0"/>
-        </w:tcBorders>
-      </w:tcPr>
-    </w:tblStylePr>
-    <w:tblStylePr w:type="firstRow">
-      <w:rPr>
-        <w:b/>
-        <w:color w:val="404040"/>
-      </w:rPr>
-      <w:pPr>
-        <w:pBdr/>
-        <w:spacing/>
-        <w:ind/>
-      </w:pPr>
-      <w:tblPr>
-        <w:tblBorders/>
-      </w:tblPr>
-      <w:tcPr>
         <w:shd w:val="clear" w:color="ffffff"/>
         <w:tcBorders>
           <w:top w:val="none" w:color="000000" w:sz="4" w:space="0"/>
@@ -6549,30 +6827,7 @@
         </w:tcBorders>
       </w:tcPr>
     </w:tblStylePr>
-    <w:tblStylePr w:type="lastCol">
-      <w:rPr>
-        <w:i/>
-        <w:color w:val="404040"/>
-      </w:rPr>
-      <w:pPr>
-        <w:pBdr/>
-        <w:spacing/>
-        <w:ind/>
-      </w:pPr>
-      <w:tblPr>
-        <w:tblBorders/>
-      </w:tblPr>
-      <w:tcPr>
-        <w:shd w:color="ffffff"/>
-        <w:tcBorders>
-          <w:top w:val="none" w:color="000000" w:sz="4" w:space="0"/>
-          <w:left w:val="none" w:color="000000" w:sz="4" w:space="0"/>
-          <w:bottom w:val="none" w:color="000000" w:sz="4" w:space="0"/>
-          <w:right w:val="none" w:color="000000" w:sz="4" w:space="0"/>
-        </w:tcBorders>
-      </w:tcPr>
-    </w:tblStylePr>
-    <w:tblStylePr w:type="lastRow">
+    <w:tblStylePr w:type="firstRow">
       <w:rPr>
         <w:b/>
         <w:color w:val="404040"/>
@@ -6595,6 +6850,52 @@
         </w:tcBorders>
       </w:tcPr>
     </w:tblStylePr>
+    <w:tblStylePr w:type="lastCol">
+      <w:rPr>
+        <w:i/>
+        <w:color w:val="404040"/>
+      </w:rPr>
+      <w:pPr>
+        <w:pBdr/>
+        <w:spacing/>
+        <w:ind/>
+      </w:pPr>
+      <w:tblPr>
+        <w:tblBorders/>
+      </w:tblPr>
+      <w:tcPr>
+        <w:shd w:val="clear" w:color="ffffff"/>
+        <w:tcBorders>
+          <w:top w:val="none" w:color="000000" w:sz="4" w:space="0"/>
+          <w:left w:val="none" w:color="000000" w:sz="4" w:space="0"/>
+          <w:bottom w:val="none" w:color="000000" w:sz="4" w:space="0"/>
+          <w:right w:val="none" w:color="000000" w:sz="4" w:space="0"/>
+        </w:tcBorders>
+      </w:tcPr>
+    </w:tblStylePr>
+    <w:tblStylePr w:type="lastRow">
+      <w:rPr>
+        <w:b/>
+        <w:color w:val="404040"/>
+      </w:rPr>
+      <w:pPr>
+        <w:pBdr/>
+        <w:spacing/>
+        <w:ind/>
+      </w:pPr>
+      <w:tblPr>
+        <w:tblBorders/>
+      </w:tblPr>
+      <w:tcPr>
+        <w:shd w:val="clear" w:color="ffffff"/>
+        <w:tcBorders>
+          <w:top w:val="none" w:color="000000" w:sz="4" w:space="0"/>
+          <w:left w:val="none" w:color="000000" w:sz="4" w:space="0"/>
+          <w:bottom w:val="none" w:color="000000" w:sz="4" w:space="0"/>
+          <w:right w:val="none" w:color="000000" w:sz="4" w:space="0"/>
+        </w:tcBorders>
+      </w:tcPr>
+    </w:tblStylePr>
     <w:tblStylePr w:type="nwCell">
       <w:pPr>
         <w:pBdr/>
@@ -6661,9 +6962,9 @@
       </w:tcPr>
     </w:tblStylePr>
   </w:style>
-  <w:style w:type="table" w:styleId="36">
+  <w:style w:type="table" w:styleId="731">
     <w:name w:val="Grid Table 3 - Accent 3"/>
-    <w:basedOn w:val="665"/>
+    <w:basedOn w:val="893"/>
     <w:uiPriority w:val="99"/>
     <w:pPr>
       <w:pBdr/>
@@ -6762,29 +7063,6 @@
         <w:tblBorders/>
       </w:tblPr>
       <w:tcPr>
-        <w:shd w:color="ffffff"/>
-        <w:tcBorders>
-          <w:top w:val="none" w:color="000000" w:sz="4" w:space="0"/>
-          <w:left w:val="none" w:color="000000" w:sz="4" w:space="0"/>
-          <w:bottom w:val="none" w:color="000000" w:sz="4" w:space="0"/>
-          <w:right w:val="none" w:color="000000" w:sz="4" w:space="0"/>
-        </w:tcBorders>
-      </w:tcPr>
-    </w:tblStylePr>
-    <w:tblStylePr w:type="firstRow">
-      <w:rPr>
-        <w:b/>
-        <w:color w:val="404040"/>
-      </w:rPr>
-      <w:pPr>
-        <w:pBdr/>
-        <w:spacing/>
-        <w:ind/>
-      </w:pPr>
-      <w:tblPr>
-        <w:tblBorders/>
-      </w:tblPr>
-      <w:tcPr>
         <w:shd w:val="clear" w:color="ffffff"/>
         <w:tcBorders>
           <w:top w:val="none" w:color="000000" w:sz="4" w:space="0"/>
@@ -6794,30 +7072,7 @@
         </w:tcBorders>
       </w:tcPr>
     </w:tblStylePr>
-    <w:tblStylePr w:type="lastCol">
-      <w:rPr>
-        <w:i/>
-        <w:color w:val="404040"/>
-      </w:rPr>
-      <w:pPr>
-        <w:pBdr/>
-        <w:spacing/>
-        <w:ind/>
-      </w:pPr>
-      <w:tblPr>
-        <w:tblBorders/>
-      </w:tblPr>
-      <w:tcPr>
-        <w:shd w:color="ffffff"/>
-        <w:tcBorders>
-          <w:top w:val="none" w:color="000000" w:sz="4" w:space="0"/>
-          <w:left w:val="none" w:color="000000" w:sz="4" w:space="0"/>
-          <w:bottom w:val="none" w:color="000000" w:sz="4" w:space="0"/>
-          <w:right w:val="none" w:color="000000" w:sz="4" w:space="0"/>
-        </w:tcBorders>
-      </w:tcPr>
-    </w:tblStylePr>
-    <w:tblStylePr w:type="lastRow">
+    <w:tblStylePr w:type="firstRow">
       <w:rPr>
         <w:b/>
         <w:color w:val="404040"/>
@@ -6840,6 +7095,52 @@
         </w:tcBorders>
       </w:tcPr>
     </w:tblStylePr>
+    <w:tblStylePr w:type="lastCol">
+      <w:rPr>
+        <w:i/>
+        <w:color w:val="404040"/>
+      </w:rPr>
+      <w:pPr>
+        <w:pBdr/>
+        <w:spacing/>
+        <w:ind/>
+      </w:pPr>
+      <w:tblPr>
+        <w:tblBorders/>
+      </w:tblPr>
+      <w:tcPr>
+        <w:shd w:val="clear" w:color="ffffff"/>
+        <w:tcBorders>
+          <w:top w:val="none" w:color="000000" w:sz="4" w:space="0"/>
+          <w:left w:val="none" w:color="000000" w:sz="4" w:space="0"/>
+          <w:bottom w:val="none" w:color="000000" w:sz="4" w:space="0"/>
+          <w:right w:val="none" w:color="000000" w:sz="4" w:space="0"/>
+        </w:tcBorders>
+      </w:tcPr>
+    </w:tblStylePr>
+    <w:tblStylePr w:type="lastRow">
+      <w:rPr>
+        <w:b/>
+        <w:color w:val="404040"/>
+      </w:rPr>
+      <w:pPr>
+        <w:pBdr/>
+        <w:spacing/>
+        <w:ind/>
+      </w:pPr>
+      <w:tblPr>
+        <w:tblBorders/>
+      </w:tblPr>
+      <w:tcPr>
+        <w:shd w:val="clear" w:color="ffffff"/>
+        <w:tcBorders>
+          <w:top w:val="none" w:color="000000" w:sz="4" w:space="0"/>
+          <w:left w:val="none" w:color="000000" w:sz="4" w:space="0"/>
+          <w:bottom w:val="none" w:color="000000" w:sz="4" w:space="0"/>
+          <w:right w:val="none" w:color="000000" w:sz="4" w:space="0"/>
+        </w:tcBorders>
+      </w:tcPr>
+    </w:tblStylePr>
     <w:tblStylePr w:type="nwCell">
       <w:pPr>
         <w:pBdr/>
@@ -6906,9 +7207,9 @@
       </w:tcPr>
     </w:tblStylePr>
   </w:style>
-  <w:style w:type="table" w:styleId="37">
+  <w:style w:type="table" w:styleId="732">
     <w:name w:val="Grid Table 3 - Accent 4"/>
-    <w:basedOn w:val="665"/>
+    <w:basedOn w:val="893"/>
     <w:uiPriority w:val="99"/>
     <w:pPr>
       <w:pBdr/>
@@ -7007,29 +7308,6 @@
         <w:tblBorders/>
       </w:tblPr>
       <w:tcPr>
-        <w:shd w:color="ffffff"/>
-        <w:tcBorders>
-          <w:top w:val="none" w:color="000000" w:sz="4" w:space="0"/>
-          <w:left w:val="none" w:color="000000" w:sz="4" w:space="0"/>
-          <w:bottom w:val="none" w:color="000000" w:sz="4" w:space="0"/>
-          <w:right w:val="none" w:color="000000" w:sz="4" w:space="0"/>
-        </w:tcBorders>
-      </w:tcPr>
-    </w:tblStylePr>
-    <w:tblStylePr w:type="firstRow">
-      <w:rPr>
-        <w:b/>
-        <w:color w:val="404040"/>
-      </w:rPr>
-      <w:pPr>
-        <w:pBdr/>
-        <w:spacing/>
-        <w:ind/>
-      </w:pPr>
-      <w:tblPr>
-        <w:tblBorders/>
-      </w:tblPr>
-      <w:tcPr>
         <w:shd w:val="clear" w:color="ffffff"/>
         <w:tcBorders>
           <w:top w:val="none" w:color="000000" w:sz="4" w:space="0"/>
@@ -7039,30 +7317,7 @@
         </w:tcBorders>
       </w:tcPr>
     </w:tblStylePr>
-    <w:tblStylePr w:type="lastCol">
-      <w:rPr>
-        <w:i/>
-        <w:color w:val="404040"/>
-      </w:rPr>
-      <w:pPr>
-        <w:pBdr/>
-        <w:spacing/>
-        <w:ind/>
-      </w:pPr>
-      <w:tblPr>
-        <w:tblBorders/>
-      </w:tblPr>
-      <w:tcPr>
-        <w:shd w:color="ffffff"/>
-        <w:tcBorders>
-          <w:top w:val="none" w:color="000000" w:sz="4" w:space="0"/>
-          <w:left w:val="none" w:color="000000" w:sz="4" w:space="0"/>
-          <w:bottom w:val="none" w:color="000000" w:sz="4" w:space="0"/>
-          <w:right w:val="none" w:color="000000" w:sz="4" w:space="0"/>
-        </w:tcBorders>
-      </w:tcPr>
-    </w:tblStylePr>
-    <w:tblStylePr w:type="lastRow">
+    <w:tblStylePr w:type="firstRow">
       <w:rPr>
         <w:b/>
         <w:color w:val="404040"/>
@@ -7085,6 +7340,52 @@
         </w:tcBorders>
       </w:tcPr>
     </w:tblStylePr>
+    <w:tblStylePr w:type="lastCol">
+      <w:rPr>
+        <w:i/>
+        <w:color w:val="404040"/>
+      </w:rPr>
+      <w:pPr>
+        <w:pBdr/>
+        <w:spacing/>
+        <w:ind/>
+      </w:pPr>
+      <w:tblPr>
+        <w:tblBorders/>
+      </w:tblPr>
+      <w:tcPr>
+        <w:shd w:val="clear" w:color="ffffff"/>
+        <w:tcBorders>
+          <w:top w:val="none" w:color="000000" w:sz="4" w:space="0"/>
+          <w:left w:val="none" w:color="000000" w:sz="4" w:space="0"/>
+          <w:bottom w:val="none" w:color="000000" w:sz="4" w:space="0"/>
+          <w:right w:val="none" w:color="000000" w:sz="4" w:space="0"/>
+        </w:tcBorders>
+      </w:tcPr>
+    </w:tblStylePr>
+    <w:tblStylePr w:type="lastRow">
+      <w:rPr>
+        <w:b/>
+        <w:color w:val="404040"/>
+      </w:rPr>
+      <w:pPr>
+        <w:pBdr/>
+        <w:spacing/>
+        <w:ind/>
+      </w:pPr>
+      <w:tblPr>
+        <w:tblBorders/>
+      </w:tblPr>
+      <w:tcPr>
+        <w:shd w:val="clear" w:color="ffffff"/>
+        <w:tcBorders>
+          <w:top w:val="none" w:color="000000" w:sz="4" w:space="0"/>
+          <w:left w:val="none" w:color="000000" w:sz="4" w:space="0"/>
+          <w:bottom w:val="none" w:color="000000" w:sz="4" w:space="0"/>
+          <w:right w:val="none" w:color="000000" w:sz="4" w:space="0"/>
+        </w:tcBorders>
+      </w:tcPr>
+    </w:tblStylePr>
     <w:tblStylePr w:type="nwCell">
       <w:pPr>
         <w:pBdr/>
@@ -7151,9 +7452,9 @@
       </w:tcPr>
     </w:tblStylePr>
   </w:style>
-  <w:style w:type="table" w:styleId="38">
+  <w:style w:type="table" w:styleId="733">
     <w:name w:val="Grid Table 3 - Accent 5"/>
-    <w:basedOn w:val="665"/>
+    <w:basedOn w:val="893"/>
     <w:uiPriority w:val="99"/>
     <w:pPr>
       <w:pBdr/>
@@ -7252,29 +7553,6 @@
         <w:tblBorders/>
       </w:tblPr>
       <w:tcPr>
-        <w:shd w:color="ffffff"/>
-        <w:tcBorders>
-          <w:top w:val="none" w:color="000000" w:sz="4" w:space="0"/>
-          <w:left w:val="none" w:color="000000" w:sz="4" w:space="0"/>
-          <w:bottom w:val="none" w:color="000000" w:sz="4" w:space="0"/>
-          <w:right w:val="none" w:color="000000" w:sz="4" w:space="0"/>
-        </w:tcBorders>
-      </w:tcPr>
-    </w:tblStylePr>
-    <w:tblStylePr w:type="firstRow">
-      <w:rPr>
-        <w:b/>
-        <w:color w:val="404040"/>
-      </w:rPr>
-      <w:pPr>
-        <w:pBdr/>
-        <w:spacing/>
-        <w:ind/>
-      </w:pPr>
-      <w:tblPr>
-        <w:tblBorders/>
-      </w:tblPr>
-      <w:tcPr>
         <w:shd w:val="clear" w:color="ffffff"/>
         <w:tcBorders>
           <w:top w:val="none" w:color="000000" w:sz="4" w:space="0"/>
@@ -7284,30 +7562,7 @@
         </w:tcBorders>
       </w:tcPr>
     </w:tblStylePr>
-    <w:tblStylePr w:type="lastCol">
-      <w:rPr>
-        <w:i/>
-        <w:color w:val="404040"/>
-      </w:rPr>
-      <w:pPr>
-        <w:pBdr/>
-        <w:spacing/>
-        <w:ind/>
-      </w:pPr>
-      <w:tblPr>
-        <w:tblBorders/>
-      </w:tblPr>
-      <w:tcPr>
-        <w:shd w:color="ffffff"/>
-        <w:tcBorders>
-          <w:top w:val="none" w:color="000000" w:sz="4" w:space="0"/>
-          <w:left w:val="none" w:color="000000" w:sz="4" w:space="0"/>
-          <w:bottom w:val="none" w:color="000000" w:sz="4" w:space="0"/>
-          <w:right w:val="none" w:color="000000" w:sz="4" w:space="0"/>
-        </w:tcBorders>
-      </w:tcPr>
-    </w:tblStylePr>
-    <w:tblStylePr w:type="lastRow">
+    <w:tblStylePr w:type="firstRow">
       <w:rPr>
         <w:b/>
         <w:color w:val="404040"/>
@@ -7330,6 +7585,52 @@
         </w:tcBorders>
       </w:tcPr>
     </w:tblStylePr>
+    <w:tblStylePr w:type="lastCol">
+      <w:rPr>
+        <w:i/>
+        <w:color w:val="404040"/>
+      </w:rPr>
+      <w:pPr>
+        <w:pBdr/>
+        <w:spacing/>
+        <w:ind/>
+      </w:pPr>
+      <w:tblPr>
+        <w:tblBorders/>
+      </w:tblPr>
+      <w:tcPr>
+        <w:shd w:val="clear" w:color="ffffff"/>
+        <w:tcBorders>
+          <w:top w:val="none" w:color="000000" w:sz="4" w:space="0"/>
+          <w:left w:val="none" w:color="000000" w:sz="4" w:space="0"/>
+          <w:bottom w:val="none" w:color="000000" w:sz="4" w:space="0"/>
+          <w:right w:val="none" w:color="000000" w:sz="4" w:space="0"/>
+        </w:tcBorders>
+      </w:tcPr>
+    </w:tblStylePr>
+    <w:tblStylePr w:type="lastRow">
+      <w:rPr>
+        <w:b/>
+        <w:color w:val="404040"/>
+      </w:rPr>
+      <w:pPr>
+        <w:pBdr/>
+        <w:spacing/>
+        <w:ind/>
+      </w:pPr>
+      <w:tblPr>
+        <w:tblBorders/>
+      </w:tblPr>
+      <w:tcPr>
+        <w:shd w:val="clear" w:color="ffffff"/>
+        <w:tcBorders>
+          <w:top w:val="none" w:color="000000" w:sz="4" w:space="0"/>
+          <w:left w:val="none" w:color="000000" w:sz="4" w:space="0"/>
+          <w:bottom w:val="none" w:color="000000" w:sz="4" w:space="0"/>
+          <w:right w:val="none" w:color="000000" w:sz="4" w:space="0"/>
+        </w:tcBorders>
+      </w:tcPr>
+    </w:tblStylePr>
     <w:tblStylePr w:type="nwCell">
       <w:pPr>
         <w:pBdr/>
@@ -7396,9 +7697,9 @@
       </w:tcPr>
     </w:tblStylePr>
   </w:style>
-  <w:style w:type="table" w:styleId="39">
+  <w:style w:type="table" w:styleId="734">
     <w:name w:val="Grid Table 3 - Accent 6"/>
-    <w:basedOn w:val="665"/>
+    <w:basedOn w:val="893"/>
     <w:uiPriority w:val="99"/>
     <w:pPr>
       <w:pBdr/>
@@ -7497,29 +7798,6 @@
         <w:tblBorders/>
       </w:tblPr>
       <w:tcPr>
-        <w:shd w:color="ffffff"/>
-        <w:tcBorders>
-          <w:top w:val="none" w:color="000000" w:sz="4" w:space="0"/>
-          <w:left w:val="none" w:color="000000" w:sz="4" w:space="0"/>
-          <w:bottom w:val="none" w:color="000000" w:sz="4" w:space="0"/>
-          <w:right w:val="none" w:color="000000" w:sz="4" w:space="0"/>
-        </w:tcBorders>
-      </w:tcPr>
-    </w:tblStylePr>
-    <w:tblStylePr w:type="firstRow">
-      <w:rPr>
-        <w:b/>
-        <w:color w:val="404040"/>
-      </w:rPr>
-      <w:pPr>
-        <w:pBdr/>
-        <w:spacing/>
-        <w:ind/>
-      </w:pPr>
-      <w:tblPr>
-        <w:tblBorders/>
-      </w:tblPr>
-      <w:tcPr>
         <w:shd w:val="clear" w:color="ffffff"/>
         <w:tcBorders>
           <w:top w:val="none" w:color="000000" w:sz="4" w:space="0"/>
@@ -7529,30 +7807,7 @@
         </w:tcBorders>
       </w:tcPr>
     </w:tblStylePr>
-    <w:tblStylePr w:type="lastCol">
-      <w:rPr>
-        <w:i/>
-        <w:color w:val="404040"/>
-      </w:rPr>
-      <w:pPr>
-        <w:pBdr/>
-        <w:spacing/>
-        <w:ind/>
-      </w:pPr>
-      <w:tblPr>
-        <w:tblBorders/>
-      </w:tblPr>
-      <w:tcPr>
-        <w:shd w:color="ffffff"/>
-        <w:tcBorders>
-          <w:top w:val="none" w:color="000000" w:sz="4" w:space="0"/>
-          <w:left w:val="none" w:color="000000" w:sz="4" w:space="0"/>
-          <w:bottom w:val="none" w:color="000000" w:sz="4" w:space="0"/>
-          <w:right w:val="none" w:color="000000" w:sz="4" w:space="0"/>
-        </w:tcBorders>
-      </w:tcPr>
-    </w:tblStylePr>
-    <w:tblStylePr w:type="lastRow">
+    <w:tblStylePr w:type="firstRow">
       <w:rPr>
         <w:b/>
         <w:color w:val="404040"/>
@@ -7575,6 +7830,52 @@
         </w:tcBorders>
       </w:tcPr>
     </w:tblStylePr>
+    <w:tblStylePr w:type="lastCol">
+      <w:rPr>
+        <w:i/>
+        <w:color w:val="404040"/>
+      </w:rPr>
+      <w:pPr>
+        <w:pBdr/>
+        <w:spacing/>
+        <w:ind/>
+      </w:pPr>
+      <w:tblPr>
+        <w:tblBorders/>
+      </w:tblPr>
+      <w:tcPr>
+        <w:shd w:val="clear" w:color="ffffff"/>
+        <w:tcBorders>
+          <w:top w:val="none" w:color="000000" w:sz="4" w:space="0"/>
+          <w:left w:val="none" w:color="000000" w:sz="4" w:space="0"/>
+          <w:bottom w:val="none" w:color="000000" w:sz="4" w:space="0"/>
+          <w:right w:val="none" w:color="000000" w:sz="4" w:space="0"/>
+        </w:tcBorders>
+      </w:tcPr>
+    </w:tblStylePr>
+    <w:tblStylePr w:type="lastRow">
+      <w:rPr>
+        <w:b/>
+        <w:color w:val="404040"/>
+      </w:rPr>
+      <w:pPr>
+        <w:pBdr/>
+        <w:spacing/>
+        <w:ind/>
+      </w:pPr>
+      <w:tblPr>
+        <w:tblBorders/>
+      </w:tblPr>
+      <w:tcPr>
+        <w:shd w:val="clear" w:color="ffffff"/>
+        <w:tcBorders>
+          <w:top w:val="none" w:color="000000" w:sz="4" w:space="0"/>
+          <w:left w:val="none" w:color="000000" w:sz="4" w:space="0"/>
+          <w:bottom w:val="none" w:color="000000" w:sz="4" w:space="0"/>
+          <w:right w:val="none" w:color="000000" w:sz="4" w:space="0"/>
+        </w:tcBorders>
+      </w:tcPr>
+    </w:tblStylePr>
     <w:tblStylePr w:type="nwCell">
       <w:pPr>
         <w:pBdr/>
@@ -7641,9 +7942,9 @@
       </w:tcPr>
     </w:tblStylePr>
   </w:style>
-  <w:style w:type="table" w:styleId="40">
+  <w:style w:type="table" w:styleId="735">
     <w:name w:val="Grid Table 4"/>
-    <w:basedOn w:val="665"/>
+    <w:basedOn w:val="893"/>
     <w:uiPriority w:val="59"/>
     <w:pPr>
       <w:pBdr/>
@@ -7874,9 +8175,9 @@
       </w:tcPr>
     </w:tblStylePr>
   </w:style>
-  <w:style w:type="table" w:styleId="41">
+  <w:style w:type="table" w:styleId="736">
     <w:name w:val="Grid Table 4 - Accent 1"/>
-    <w:basedOn w:val="665"/>
+    <w:basedOn w:val="893"/>
     <w:uiPriority w:val="59"/>
     <w:pPr>
       <w:pBdr/>
@@ -8107,9 +8408,9 @@
       </w:tcPr>
     </w:tblStylePr>
   </w:style>
-  <w:style w:type="table" w:styleId="42">
+  <w:style w:type="table" w:styleId="737">
     <w:name w:val="Grid Table 4 - Accent 2"/>
-    <w:basedOn w:val="665"/>
+    <w:basedOn w:val="893"/>
     <w:uiPriority w:val="59"/>
     <w:pPr>
       <w:pBdr/>
@@ -8340,9 +8641,9 @@
       </w:tcPr>
     </w:tblStylePr>
   </w:style>
-  <w:style w:type="table" w:styleId="43">
+  <w:style w:type="table" w:styleId="738">
     <w:name w:val="Grid Table 4 - Accent 3"/>
-    <w:basedOn w:val="665"/>
+    <w:basedOn w:val="893"/>
     <w:uiPriority w:val="59"/>
     <w:pPr>
       <w:pBdr/>
@@ -8573,9 +8874,9 @@
       </w:tcPr>
     </w:tblStylePr>
   </w:style>
-  <w:style w:type="table" w:styleId="44">
+  <w:style w:type="table" w:styleId="739">
     <w:name w:val="Grid Table 4 - Accent 4"/>
-    <w:basedOn w:val="665"/>
+    <w:basedOn w:val="893"/>
     <w:uiPriority w:val="59"/>
     <w:pPr>
       <w:pBdr/>
@@ -8806,9 +9107,9 @@
       </w:tcPr>
     </w:tblStylePr>
   </w:style>
-  <w:style w:type="table" w:styleId="45">
+  <w:style w:type="table" w:styleId="740">
     <w:name w:val="Grid Table 4 - Accent 5"/>
-    <w:basedOn w:val="665"/>
+    <w:basedOn w:val="893"/>
     <w:uiPriority w:val="59"/>
     <w:pPr>
       <w:pBdr/>
@@ -9039,9 +9340,9 @@
       </w:tcPr>
     </w:tblStylePr>
   </w:style>
-  <w:style w:type="table" w:styleId="46">
+  <w:style w:type="table" w:styleId="741">
     <w:name w:val="Grid Table 4 - Accent 6"/>
-    <w:basedOn w:val="665"/>
+    <w:basedOn w:val="893"/>
     <w:uiPriority w:val="59"/>
     <w:pPr>
       <w:pBdr/>
@@ -9272,9 +9573,9 @@
       </w:tcPr>
     </w:tblStylePr>
   </w:style>
-  <w:style w:type="table" w:styleId="47">
+  <w:style w:type="table" w:styleId="742">
     <w:name w:val="Grid Table 5 Dark"/>
-    <w:basedOn w:val="665"/>
+    <w:basedOn w:val="893"/>
     <w:uiPriority w:val="99"/>
     <w:pPr>
       <w:pBdr/>
@@ -9500,9 +9801,9 @@
       </w:tcPr>
     </w:tblStylePr>
   </w:style>
-  <w:style w:type="table" w:styleId="48">
+  <w:style w:type="table" w:styleId="743">
     <w:name w:val="Grid Table 5 Dark- Accent 1"/>
-    <w:basedOn w:val="665"/>
+    <w:basedOn w:val="893"/>
     <w:uiPriority w:val="99"/>
     <w:pPr>
       <w:pBdr/>
@@ -9728,9 +10029,9 @@
       </w:tcPr>
     </w:tblStylePr>
   </w:style>
-  <w:style w:type="table" w:styleId="49">
+  <w:style w:type="table" w:styleId="744">
     <w:name w:val="Grid Table 5 Dark - Accent 2"/>
-    <w:basedOn w:val="665"/>
+    <w:basedOn w:val="893"/>
     <w:uiPriority w:val="99"/>
     <w:pPr>
       <w:pBdr/>
@@ -9956,9 +10257,9 @@
       </w:tcPr>
     </w:tblStylePr>
   </w:style>
-  <w:style w:type="table" w:styleId="50">
+  <w:style w:type="table" w:styleId="745">
     <w:name w:val="Grid Table 5 Dark - Accent 3"/>
-    <w:basedOn w:val="665"/>
+    <w:basedOn w:val="893"/>
     <w:uiPriority w:val="99"/>
     <w:pPr>
       <w:pBdr/>
@@ -10184,9 +10485,9 @@
       </w:tcPr>
     </w:tblStylePr>
   </w:style>
-  <w:style w:type="table" w:styleId="51">
+  <w:style w:type="table" w:styleId="746">
     <w:name w:val="Grid Table 5 Dark- Accent 4"/>
-    <w:basedOn w:val="665"/>
+    <w:basedOn w:val="893"/>
     <w:uiPriority w:val="99"/>
     <w:pPr>
       <w:pBdr/>
@@ -10412,9 +10713,9 @@
       </w:tcPr>
     </w:tblStylePr>
   </w:style>
-  <w:style w:type="table" w:styleId="52">
+  <w:style w:type="table" w:styleId="747">
     <w:name w:val="Grid Table 5 Dark - Accent 5"/>
-    <w:basedOn w:val="665"/>
+    <w:basedOn w:val="893"/>
     <w:uiPriority w:val="99"/>
     <w:pPr>
       <w:pBdr/>
@@ -10640,9 +10941,9 @@
       </w:tcPr>
     </w:tblStylePr>
   </w:style>
-  <w:style w:type="table" w:styleId="53">
+  <w:style w:type="table" w:styleId="748">
     <w:name w:val="Grid Table 5 Dark - Accent 6"/>
-    <w:basedOn w:val="665"/>
+    <w:basedOn w:val="893"/>
     <w:uiPriority w:val="99"/>
     <w:pPr>
       <w:pBdr/>
@@ -10868,9 +11169,9 @@
       </w:tcPr>
     </w:tblStylePr>
   </w:style>
-  <w:style w:type="table" w:styleId="54">
+  <w:style w:type="table" w:styleId="749">
     <w:name w:val="Grid Table 6 Colorful"/>
-    <w:basedOn w:val="665"/>
+    <w:basedOn w:val="893"/>
     <w:uiPriority w:val="99"/>
     <w:pPr>
       <w:pBdr/>
@@ -11098,9 +11399,9 @@
       </w:tcPr>
     </w:tblStylePr>
   </w:style>
-  <w:style w:type="table" w:styleId="55">
+  <w:style w:type="table" w:styleId="750">
     <w:name w:val="Grid Table 6 Colorful - Accent 1"/>
-    <w:basedOn w:val="665"/>
+    <w:basedOn w:val="893"/>
     <w:uiPriority w:val="99"/>
     <w:pPr>
       <w:pBdr/>
@@ -11328,9 +11629,9 @@
       </w:tcPr>
     </w:tblStylePr>
   </w:style>
-  <w:style w:type="table" w:styleId="56">
+  <w:style w:type="table" w:styleId="751">
     <w:name w:val="Grid Table 6 Colorful - Accent 2"/>
-    <w:basedOn w:val="665"/>
+    <w:basedOn w:val="893"/>
     <w:uiPriority w:val="99"/>
     <w:pPr>
       <w:pBdr/>
@@ -11558,9 +11859,9 @@
       </w:tcPr>
     </w:tblStylePr>
   </w:style>
-  <w:style w:type="table" w:styleId="57">
+  <w:style w:type="table" w:styleId="752">
     <w:name w:val="Grid Table 6 Colorful - Accent 3"/>
-    <w:basedOn w:val="665"/>
+    <w:basedOn w:val="893"/>
     <w:uiPriority w:val="99"/>
     <w:pPr>
       <w:pBdr/>
@@ -11788,9 +12089,9 @@
       </w:tcPr>
     </w:tblStylePr>
   </w:style>
-  <w:style w:type="table" w:styleId="58">
+  <w:style w:type="table" w:styleId="753">
     <w:name w:val="Grid Table 6 Colorful - Accent 4"/>
-    <w:basedOn w:val="665"/>
+    <w:basedOn w:val="893"/>
     <w:uiPriority w:val="99"/>
     <w:pPr>
       <w:pBdr/>
@@ -12018,9 +12319,9 @@
       </w:tcPr>
     </w:tblStylePr>
   </w:style>
-  <w:style w:type="table" w:styleId="59">
+  <w:style w:type="table" w:styleId="754">
     <w:name w:val="Grid Table 6 Colorful - Accent 5"/>
-    <w:basedOn w:val="665"/>
+    <w:basedOn w:val="893"/>
     <w:uiPriority w:val="99"/>
     <w:pPr>
       <w:pBdr/>
@@ -12248,9 +12549,9 @@
       </w:tcPr>
     </w:tblStylePr>
   </w:style>
-  <w:style w:type="table" w:styleId="60">
+  <w:style w:type="table" w:styleId="755">
     <w:name w:val="Grid Table 6 Colorful - Accent 6"/>
-    <w:basedOn w:val="665"/>
+    <w:basedOn w:val="893"/>
     <w:uiPriority w:val="99"/>
     <w:pPr>
       <w:pBdr/>
@@ -12478,9 +12779,9 @@
       </w:tcPr>
     </w:tblStylePr>
   </w:style>
-  <w:style w:type="table" w:styleId="61">
+  <w:style w:type="table" w:styleId="756">
     <w:name w:val="Grid Table 7 Colorful"/>
-    <w:basedOn w:val="665"/>
+    <w:basedOn w:val="893"/>
     <w:uiPriority w:val="99"/>
     <w:pPr>
       <w:pBdr/>
@@ -12582,11 +12883,11 @@
         <w:tblBorders/>
       </w:tblPr>
       <w:tcPr>
-        <w:shd w:color="ffffff"/>
+        <w:shd w:val="clear" w:color="ffffff"/>
         <w:tcBorders>
-          <w:top w:val="none"/>
-          <w:left w:val="none"/>
-          <w:bottom w:val="none"/>
+          <w:top w:val="none" w:color="000000" w:sz="4" w:space="0"/>
+          <w:left w:val="none" w:color="000000" w:sz="4" w:space="0"/>
+          <w:bottom w:val="none" w:color="000000" w:sz="4" w:space="0"/>
           <w:right w:val="single" w:color="000000" w:themeColor="text1" w:themeTint="80" w:sz="4" w:space="0"/>
         </w:tcBorders>
       </w:tcPr>
@@ -12609,10 +12910,10 @@
       <w:tcPr>
         <w:shd w:val="clear" w:color="ffffff" w:themeColor="light1" w:fill="ffffff" w:themeFill="light1"/>
         <w:tcBorders>
-          <w:top w:val="none"/>
-          <w:left w:val="none"/>
+          <w:top w:val="none" w:color="000000" w:sz="4" w:space="0"/>
+          <w:left w:val="none" w:color="000000" w:sz="4" w:space="0"/>
           <w:bottom w:val="single" w:color="000000" w:themeColor="text1" w:themeTint="80" w:sz="4" w:space="0"/>
-          <w:right w:val="none"/>
+          <w:right w:val="none" w:color="000000" w:sz="4" w:space="0"/>
         </w:tcBorders>
       </w:tcPr>
     </w:tblStylePr>
@@ -12632,12 +12933,12 @@
         <w:tblBorders/>
       </w:tblPr>
       <w:tcPr>
-        <w:shd w:color="ffffff"/>
+        <w:shd w:val="clear" w:color="ffffff"/>
         <w:tcBorders>
-          <w:top w:val="none"/>
+          <w:top w:val="none" w:color="000000" w:sz="4" w:space="0"/>
           <w:left w:val="single" w:color="000000" w:themeColor="text1" w:themeTint="80" w:sz="4" w:space="0"/>
-          <w:bottom w:val="none"/>
-          <w:right w:val="none"/>
+          <w:bottom w:val="none" w:color="000000" w:sz="4" w:space="0"/>
+          <w:right w:val="none" w:color="000000" w:sz="4" w:space="0"/>
         </w:tcBorders>
       </w:tcPr>
     </w:tblStylePr>
@@ -12660,9 +12961,9 @@
         <w:shd w:val="clear" w:color="ffffff" w:themeColor="light1" w:fill="ffffff" w:themeFill="light1"/>
         <w:tcBorders>
           <w:top w:val="single" w:color="000000" w:themeColor="text1" w:themeTint="80" w:sz="4" w:space="0"/>
-          <w:left w:val="none"/>
-          <w:bottom w:val="none"/>
-          <w:right w:val="none"/>
+          <w:left w:val="none" w:color="000000" w:sz="4" w:space="0"/>
+          <w:bottom w:val="none" w:color="000000" w:sz="4" w:space="0"/>
+          <w:right w:val="none" w:color="000000" w:sz="4" w:space="0"/>
         </w:tcBorders>
       </w:tcPr>
     </w:tblStylePr>
@@ -12732,9 +13033,9 @@
       </w:tcPr>
     </w:tblStylePr>
   </w:style>
-  <w:style w:type="table" w:styleId="62">
+  <w:style w:type="table" w:styleId="757">
     <w:name w:val="Grid Table 7 Colorful - Accent 1"/>
-    <w:basedOn w:val="665"/>
+    <w:basedOn w:val="893"/>
     <w:uiPriority w:val="99"/>
     <w:pPr>
       <w:pBdr/>
@@ -12836,11 +13137,11 @@
         <w:tblBorders/>
       </w:tblPr>
       <w:tcPr>
-        <w:shd w:color="ffffff"/>
+        <w:shd w:val="clear" w:color="ffffff"/>
         <w:tcBorders>
-          <w:top w:val="none"/>
-          <w:left w:val="none"/>
-          <w:bottom w:val="none"/>
+          <w:top w:val="none" w:color="000000" w:sz="4" w:space="0"/>
+          <w:left w:val="none" w:color="000000" w:sz="4" w:space="0"/>
+          <w:bottom w:val="none" w:color="000000" w:sz="4" w:space="0"/>
           <w:right w:val="single" w:color="000000" w:themeColor="accent1" w:themeTint="80" w:sz="4" w:space="0"/>
         </w:tcBorders>
       </w:tcPr>
@@ -12863,10 +13164,10 @@
       <w:tcPr>
         <w:shd w:val="clear" w:color="ffffff" w:themeColor="light1" w:fill="ffffff" w:themeFill="light1"/>
         <w:tcBorders>
-          <w:top w:val="none"/>
-          <w:left w:val="none"/>
+          <w:top w:val="none" w:color="000000" w:sz="4" w:space="0"/>
+          <w:left w:val="none" w:color="000000" w:sz="4" w:space="0"/>
           <w:bottom w:val="single" w:color="000000" w:themeColor="accent1" w:themeTint="80" w:sz="4" w:space="0"/>
-          <w:right w:val="none"/>
+          <w:right w:val="none" w:color="000000" w:sz="4" w:space="0"/>
         </w:tcBorders>
       </w:tcPr>
     </w:tblStylePr>
@@ -12886,12 +13187,12 @@
         <w:tblBorders/>
       </w:tblPr>
       <w:tcPr>
-        <w:shd w:color="ffffff"/>
+        <w:shd w:val="clear" w:color="ffffff"/>
         <w:tcBorders>
-          <w:top w:val="none"/>
+          <w:top w:val="none" w:color="000000" w:sz="4" w:space="0"/>
           <w:left w:val="single" w:color="000000" w:themeColor="accent1" w:themeTint="80" w:sz="4" w:space="0"/>
-          <w:bottom w:val="none"/>
-          <w:right w:val="none"/>
+          <w:bottom w:val="none" w:color="000000" w:sz="4" w:space="0"/>
+          <w:right w:val="none" w:color="000000" w:sz="4" w:space="0"/>
         </w:tcBorders>
       </w:tcPr>
     </w:tblStylePr>
@@ -12914,9 +13215,9 @@
         <w:shd w:val="clear" w:color="ffffff" w:themeColor="light1" w:fill="ffffff" w:themeFill="light1"/>
         <w:tcBorders>
           <w:top w:val="single" w:color="000000" w:themeColor="accent1" w:themeTint="80" w:sz="4" w:space="0"/>
-          <w:left w:val="none"/>
-          <w:bottom w:val="none"/>
-          <w:right w:val="none"/>
+          <w:left w:val="none" w:color="000000" w:sz="4" w:space="0"/>
+          <w:bottom w:val="none" w:color="000000" w:sz="4" w:space="0"/>
+          <w:right w:val="none" w:color="000000" w:sz="4" w:space="0"/>
         </w:tcBorders>
       </w:tcPr>
     </w:tblStylePr>
@@ -12986,9 +13287,9 @@
       </w:tcPr>
     </w:tblStylePr>
   </w:style>
-  <w:style w:type="table" w:styleId="63">
+  <w:style w:type="table" w:styleId="758">
     <w:name w:val="Grid Table 7 Colorful - Accent 2"/>
-    <w:basedOn w:val="665"/>
+    <w:basedOn w:val="893"/>
     <w:uiPriority w:val="99"/>
     <w:pPr>
       <w:pBdr/>
@@ -13090,11 +13391,11 @@
         <w:tblBorders/>
       </w:tblPr>
       <w:tcPr>
-        <w:shd w:color="ffffff"/>
+        <w:shd w:val="clear" w:color="ffffff"/>
         <w:tcBorders>
-          <w:top w:val="none"/>
-          <w:left w:val="none"/>
-          <w:bottom w:val="none"/>
+          <w:top w:val="none" w:color="000000" w:sz="4" w:space="0"/>
+          <w:left w:val="none" w:color="000000" w:sz="4" w:space="0"/>
+          <w:bottom w:val="none" w:color="000000" w:sz="4" w:space="0"/>
           <w:right w:val="single" w:color="000000" w:themeColor="accent2" w:themeTint="97" w:sz="4" w:space="0"/>
         </w:tcBorders>
       </w:tcPr>
@@ -13117,10 +13418,10 @@
       <w:tcPr>
         <w:shd w:val="clear" w:color="ffffff" w:themeColor="light1" w:fill="ffffff" w:themeFill="light1"/>
         <w:tcBorders>
-          <w:top w:val="none"/>
-          <w:left w:val="none"/>
+          <w:top w:val="none" w:color="000000" w:sz="4" w:space="0"/>
+          <w:left w:val="none" w:color="000000" w:sz="4" w:space="0"/>
           <w:bottom w:val="single" w:color="000000" w:themeColor="accent2" w:themeTint="97" w:sz="4" w:space="0"/>
-          <w:right w:val="none"/>
+          <w:right w:val="none" w:color="000000" w:sz="4" w:space="0"/>
         </w:tcBorders>
       </w:tcPr>
     </w:tblStylePr>
@@ -13140,12 +13441,12 @@
         <w:tblBorders/>
       </w:tblPr>
       <w:tcPr>
-        <w:shd w:color="ffffff"/>
+        <w:shd w:val="clear" w:color="ffffff"/>
         <w:tcBorders>
-          <w:top w:val="none"/>
+          <w:top w:val="none" w:color="000000" w:sz="4" w:space="0"/>
           <w:left w:val="single" w:color="000000" w:themeColor="accent2" w:themeTint="97" w:sz="4" w:space="0"/>
-          <w:bottom w:val="none"/>
-          <w:right w:val="none"/>
+          <w:bottom w:val="none" w:color="000000" w:sz="4" w:space="0"/>
+          <w:right w:val="none" w:color="000000" w:sz="4" w:space="0"/>
         </w:tcBorders>
       </w:tcPr>
     </w:tblStylePr>
@@ -13168,9 +13469,9 @@
         <w:shd w:val="clear" w:color="ffffff" w:themeColor="light1" w:fill="ffffff" w:themeFill="light1"/>
         <w:tcBorders>
           <w:top w:val="single" w:color="000000" w:themeColor="accent2" w:themeTint="97" w:sz="4" w:space="0"/>
-          <w:left w:val="none"/>
-          <w:bottom w:val="none"/>
-          <w:right w:val="none"/>
+          <w:left w:val="none" w:color="000000" w:sz="4" w:space="0"/>
+          <w:bottom w:val="none" w:color="000000" w:sz="4" w:space="0"/>
+          <w:right w:val="none" w:color="000000" w:sz="4" w:space="0"/>
         </w:tcBorders>
       </w:tcPr>
     </w:tblStylePr>
@@ -13240,9 +13541,9 @@
       </w:tcPr>
     </w:tblStylePr>
   </w:style>
-  <w:style w:type="table" w:styleId="64">
+  <w:style w:type="table" w:styleId="759">
     <w:name w:val="Grid Table 7 Colorful - Accent 3"/>
-    <w:basedOn w:val="665"/>
+    <w:basedOn w:val="893"/>
     <w:uiPriority w:val="99"/>
     <w:pPr>
       <w:pBdr/>
@@ -13344,11 +13645,11 @@
         <w:tblBorders/>
       </w:tblPr>
       <w:tcPr>
-        <w:shd w:color="ffffff"/>
+        <w:shd w:val="clear" w:color="ffffff"/>
         <w:tcBorders>
-          <w:top w:val="none"/>
-          <w:left w:val="none"/>
-          <w:bottom w:val="none"/>
+          <w:top w:val="none" w:color="000000" w:sz="4" w:space="0"/>
+          <w:left w:val="none" w:color="000000" w:sz="4" w:space="0"/>
+          <w:bottom w:val="none" w:color="000000" w:sz="4" w:space="0"/>
           <w:right w:val="single" w:color="000000" w:themeColor="accent3" w:themeTint="FE" w:sz="4" w:space="0"/>
         </w:tcBorders>
       </w:tcPr>
@@ -13371,10 +13672,10 @@
       <w:tcPr>
         <w:shd w:val="clear" w:color="ffffff" w:themeColor="light1" w:fill="ffffff" w:themeFill="light1"/>
         <w:tcBorders>
-          <w:top w:val="none"/>
-          <w:left w:val="none"/>
+          <w:top w:val="none" w:color="000000" w:sz="4" w:space="0"/>
+          <w:left w:val="none" w:color="000000" w:sz="4" w:space="0"/>
           <w:bottom w:val="single" w:color="000000" w:themeColor="accent3" w:themeTint="FE" w:sz="4" w:space="0"/>
-          <w:right w:val="none"/>
+          <w:right w:val="none" w:color="000000" w:sz="4" w:space="0"/>
         </w:tcBorders>
       </w:tcPr>
     </w:tblStylePr>
@@ -13394,12 +13695,12 @@
         <w:tblBorders/>
       </w:tblPr>
       <w:tcPr>
-        <w:shd w:color="ffffff"/>
+        <w:shd w:val="clear" w:color="ffffff"/>
         <w:tcBorders>
-          <w:top w:val="none"/>
+          <w:top w:val="none" w:color="000000" w:sz="4" w:space="0"/>
           <w:left w:val="single" w:color="000000" w:themeColor="accent3" w:themeTint="FE" w:sz="4" w:space="0"/>
-          <w:bottom w:val="none"/>
-          <w:right w:val="none"/>
+          <w:bottom w:val="none" w:color="000000" w:sz="4" w:space="0"/>
+          <w:right w:val="none" w:color="000000" w:sz="4" w:space="0"/>
         </w:tcBorders>
       </w:tcPr>
     </w:tblStylePr>
@@ -13422,9 +13723,9 @@
         <w:shd w:val="clear" w:color="ffffff" w:themeColor="light1" w:fill="ffffff" w:themeFill="light1"/>
         <w:tcBorders>
           <w:top w:val="single" w:color="000000" w:themeColor="accent3" w:themeTint="FE" w:sz="4" w:space="0"/>
-          <w:left w:val="none"/>
-          <w:bottom w:val="none"/>
-          <w:right w:val="none"/>
+          <w:left w:val="none" w:color="000000" w:sz="4" w:space="0"/>
+          <w:bottom w:val="none" w:color="000000" w:sz="4" w:space="0"/>
+          <w:right w:val="none" w:color="000000" w:sz="4" w:space="0"/>
         </w:tcBorders>
       </w:tcPr>
     </w:tblStylePr>
@@ -13494,9 +13795,9 @@
       </w:tcPr>
     </w:tblStylePr>
   </w:style>
-  <w:style w:type="table" w:styleId="65">
+  <w:style w:type="table" w:styleId="760">
     <w:name w:val="Grid Table 7 Colorful - Accent 4"/>
-    <w:basedOn w:val="665"/>
+    <w:basedOn w:val="893"/>
     <w:uiPriority w:val="99"/>
     <w:pPr>
       <w:pBdr/>
@@ -13598,11 +13899,11 @@
         <w:tblBorders/>
       </w:tblPr>
       <w:tcPr>
-        <w:shd w:color="ffffff"/>
+        <w:shd w:val="clear" w:color="ffffff"/>
         <w:tcBorders>
-          <w:top w:val="none"/>
-          <w:left w:val="none"/>
-          <w:bottom w:val="none"/>
+          <w:top w:val="none" w:color="000000" w:sz="4" w:space="0"/>
+          <w:left w:val="none" w:color="000000" w:sz="4" w:space="0"/>
+          <w:bottom w:val="none" w:color="000000" w:sz="4" w:space="0"/>
           <w:right w:val="single" w:color="000000" w:themeColor="accent4" w:themeTint="9A" w:sz="4" w:space="0"/>
         </w:tcBorders>
       </w:tcPr>
@@ -13625,10 +13926,10 @@
       <w:tcPr>
         <w:shd w:val="clear" w:color="ffffff" w:themeColor="light1" w:fill="ffffff" w:themeFill="light1"/>
         <w:tcBorders>
-          <w:top w:val="none"/>
-          <w:left w:val="none"/>
+          <w:top w:val="none" w:color="000000" w:sz="4" w:space="0"/>
+          <w:left w:val="none" w:color="000000" w:sz="4" w:space="0"/>
           <w:bottom w:val="single" w:color="000000" w:themeColor="accent4" w:themeTint="9A" w:sz="4" w:space="0"/>
-          <w:right w:val="none"/>
+          <w:right w:val="none" w:color="000000" w:sz="4" w:space="0"/>
         </w:tcBorders>
       </w:tcPr>
     </w:tblStylePr>
@@ -13648,12 +13949,12 @@
         <w:tblBorders/>
       </w:tblPr>
       <w:tcPr>
-        <w:shd w:color="ffffff"/>
+        <w:shd w:val="clear" w:color="ffffff"/>
         <w:tcBorders>
-          <w:top w:val="none"/>
+          <w:top w:val="none" w:color="000000" w:sz="4" w:space="0"/>
           <w:left w:val="single" w:color="000000" w:themeColor="accent4" w:themeTint="9A" w:sz="4" w:space="0"/>
-          <w:bottom w:val="none"/>
-          <w:right w:val="none"/>
+          <w:bottom w:val="none" w:color="000000" w:sz="4" w:space="0"/>
+          <w:right w:val="none" w:color="000000" w:sz="4" w:space="0"/>
         </w:tcBorders>
       </w:tcPr>
     </w:tblStylePr>
@@ -13676,9 +13977,9 @@
         <w:shd w:val="clear" w:color="ffffff" w:themeColor="light1" w:fill="ffffff" w:themeFill="light1"/>
         <w:tcBorders>
           <w:top w:val="single" w:color="000000" w:themeColor="accent4" w:themeTint="9A" w:sz="4" w:space="0"/>
-          <w:left w:val="none"/>
-          <w:bottom w:val="none"/>
-          <w:right w:val="none"/>
+          <w:left w:val="none" w:color="000000" w:sz="4" w:space="0"/>
+          <w:bottom w:val="none" w:color="000000" w:sz="4" w:space="0"/>
+          <w:right w:val="none" w:color="000000" w:sz="4" w:space="0"/>
         </w:tcBorders>
       </w:tcPr>
     </w:tblStylePr>
@@ -13748,9 +14049,9 @@
       </w:tcPr>
     </w:tblStylePr>
   </w:style>
-  <w:style w:type="table" w:styleId="66">
+  <w:style w:type="table" w:styleId="761">
     <w:name w:val="Grid Table 7 Colorful - Accent 5"/>
-    <w:basedOn w:val="665"/>
+    <w:basedOn w:val="893"/>
     <w:uiPriority w:val="99"/>
     <w:pPr>
       <w:pBdr/>
@@ -13852,11 +14153,11 @@
         <w:tblBorders/>
       </w:tblPr>
       <w:tcPr>
-        <w:shd w:color="ffffff"/>
+        <w:shd w:val="clear" w:color="ffffff"/>
         <w:tcBorders>
-          <w:top w:val="none"/>
-          <w:left w:val="none"/>
-          <w:bottom w:val="none"/>
+          <w:top w:val="none" w:color="000000" w:sz="4" w:space="0"/>
+          <w:left w:val="none" w:color="000000" w:sz="4" w:space="0"/>
+          <w:bottom w:val="none" w:color="000000" w:sz="4" w:space="0"/>
           <w:right w:val="single" w:color="000000" w:themeColor="accent5" w:themeTint="90" w:sz="4" w:space="0"/>
         </w:tcBorders>
       </w:tcPr>
@@ -13879,10 +14180,10 @@
       <w:tcPr>
         <w:shd w:val="clear" w:color="ffffff" w:themeColor="light1" w:fill="ffffff" w:themeFill="light1"/>
         <w:tcBorders>
-          <w:top w:val="none"/>
-          <w:left w:val="none"/>
+          <w:top w:val="none" w:color="000000" w:sz="4" w:space="0"/>
+          <w:left w:val="none" w:color="000000" w:sz="4" w:space="0"/>
           <w:bottom w:val="single" w:color="000000" w:themeColor="accent5" w:themeTint="90" w:sz="4" w:space="0"/>
-          <w:right w:val="none"/>
+          <w:right w:val="none" w:color="000000" w:sz="4" w:space="0"/>
         </w:tcBorders>
       </w:tcPr>
     </w:tblStylePr>
@@ -13902,12 +14203,12 @@
         <w:tblBorders/>
       </w:tblPr>
       <w:tcPr>
-        <w:shd w:color="ffffff"/>
+        <w:shd w:val="clear" w:color="ffffff"/>
         <w:tcBorders>
-          <w:top w:val="none"/>
+          <w:top w:val="none" w:color="000000" w:sz="4" w:space="0"/>
           <w:left w:val="single" w:color="000000" w:themeColor="accent5" w:themeTint="90" w:sz="4" w:space="0"/>
-          <w:bottom w:val="none"/>
-          <w:right w:val="none"/>
+          <w:bottom w:val="none" w:color="000000" w:sz="4" w:space="0"/>
+          <w:right w:val="none" w:color="000000" w:sz="4" w:space="0"/>
         </w:tcBorders>
       </w:tcPr>
     </w:tblStylePr>
@@ -13930,9 +14231,9 @@
         <w:shd w:val="clear" w:color="ffffff" w:themeColor="light1" w:fill="ffffff" w:themeFill="light1"/>
         <w:tcBorders>
           <w:top w:val="single" w:color="000000" w:themeColor="accent5" w:themeTint="90" w:sz="4" w:space="0"/>
-          <w:left w:val="none"/>
-          <w:bottom w:val="none"/>
-          <w:right w:val="none"/>
+          <w:left w:val="none" w:color="000000" w:sz="4" w:space="0"/>
+          <w:bottom w:val="none" w:color="000000" w:sz="4" w:space="0"/>
+          <w:right w:val="none" w:color="000000" w:sz="4" w:space="0"/>
         </w:tcBorders>
       </w:tcPr>
     </w:tblStylePr>
@@ -14002,9 +14303,9 @@
       </w:tcPr>
     </w:tblStylePr>
   </w:style>
-  <w:style w:type="table" w:styleId="67">
+  <w:style w:type="table" w:styleId="762">
     <w:name w:val="Grid Table 7 Colorful - Accent 6"/>
-    <w:basedOn w:val="665"/>
+    <w:basedOn w:val="893"/>
     <w:uiPriority w:val="99"/>
     <w:pPr>
       <w:pBdr/>
@@ -14106,11 +14407,11 @@
         <w:tblBorders/>
       </w:tblPr>
       <w:tcPr>
-        <w:shd w:color="ffffff"/>
+        <w:shd w:val="clear" w:color="ffffff"/>
         <w:tcBorders>
-          <w:top w:val="none"/>
-          <w:left w:val="none"/>
-          <w:bottom w:val="none"/>
+          <w:top w:val="none" w:color="000000" w:sz="4" w:space="0"/>
+          <w:left w:val="none" w:color="000000" w:sz="4" w:space="0"/>
+          <w:bottom w:val="none" w:color="000000" w:sz="4" w:space="0"/>
           <w:right w:val="single" w:color="000000" w:themeColor="accent6" w:themeTint="90" w:sz="4" w:space="0"/>
         </w:tcBorders>
       </w:tcPr>
@@ -14133,10 +14434,10 @@
       <w:tcPr>
         <w:shd w:val="clear" w:color="ffffff" w:themeColor="light1" w:fill="ffffff" w:themeFill="light1"/>
         <w:tcBorders>
-          <w:top w:val="none"/>
-          <w:left w:val="none"/>
+          <w:top w:val="none" w:color="000000" w:sz="4" w:space="0"/>
+          <w:left w:val="none" w:color="000000" w:sz="4" w:space="0"/>
           <w:bottom w:val="single" w:color="000000" w:themeColor="accent6" w:themeTint="90" w:sz="4" w:space="0"/>
-          <w:right w:val="none"/>
+          <w:right w:val="none" w:color="000000" w:sz="4" w:space="0"/>
         </w:tcBorders>
       </w:tcPr>
     </w:tblStylePr>
@@ -14156,12 +14457,12 @@
         <w:tblBorders/>
       </w:tblPr>
       <w:tcPr>
-        <w:shd w:color="ffffff"/>
+        <w:shd w:val="clear" w:color="ffffff"/>
         <w:tcBorders>
-          <w:top w:val="none"/>
+          <w:top w:val="none" w:color="000000" w:sz="4" w:space="0"/>
           <w:left w:val="single" w:color="000000" w:themeColor="accent6" w:themeTint="90" w:sz="4" w:space="0"/>
-          <w:bottom w:val="none"/>
-          <w:right w:val="none"/>
+          <w:bottom w:val="none" w:color="000000" w:sz="4" w:space="0"/>
+          <w:right w:val="none" w:color="000000" w:sz="4" w:space="0"/>
         </w:tcBorders>
       </w:tcPr>
     </w:tblStylePr>
@@ -14184,9 +14485,9 @@
         <w:shd w:val="clear" w:color="ffffff" w:themeColor="light1" w:fill="ffffff" w:themeFill="light1"/>
         <w:tcBorders>
           <w:top w:val="single" w:color="000000" w:themeColor="accent6" w:themeTint="90" w:sz="4" w:space="0"/>
-          <w:left w:val="none"/>
-          <w:bottom w:val="none"/>
-          <w:right w:val="none"/>
+          <w:left w:val="none" w:color="000000" w:sz="4" w:space="0"/>
+          <w:bottom w:val="none" w:color="000000" w:sz="4" w:space="0"/>
+          <w:right w:val="none" w:color="000000" w:sz="4" w:space="0"/>
         </w:tcBorders>
       </w:tcPr>
     </w:tblStylePr>
@@ -14256,9 +14557,9 @@
       </w:tcPr>
     </w:tblStylePr>
   </w:style>
-  <w:style w:type="table" w:styleId="68">
+  <w:style w:type="table" w:styleId="763">
     <w:name w:val="List Table 1 Light"/>
-    <w:basedOn w:val="665"/>
+    <w:basedOn w:val="893"/>
     <w:uiPriority w:val="99"/>
     <w:pPr>
       <w:pBdr/>
@@ -14472,9 +14773,9 @@
       </w:tcPr>
     </w:tblStylePr>
   </w:style>
-  <w:style w:type="table" w:styleId="69">
+  <w:style w:type="table" w:styleId="764">
     <w:name w:val="List Table 1 Light - Accent 1"/>
-    <w:basedOn w:val="665"/>
+    <w:basedOn w:val="893"/>
     <w:uiPriority w:val="99"/>
     <w:pPr>
       <w:pBdr/>
@@ -14688,9 +14989,9 @@
       </w:tcPr>
     </w:tblStylePr>
   </w:style>
-  <w:style w:type="table" w:styleId="70">
+  <w:style w:type="table" w:styleId="765">
     <w:name w:val="List Table 1 Light - Accent 2"/>
-    <w:basedOn w:val="665"/>
+    <w:basedOn w:val="893"/>
     <w:uiPriority w:val="99"/>
     <w:pPr>
       <w:pBdr/>
@@ -14904,9 +15205,9 @@
       </w:tcPr>
     </w:tblStylePr>
   </w:style>
-  <w:style w:type="table" w:styleId="71">
+  <w:style w:type="table" w:styleId="766">
     <w:name w:val="List Table 1 Light - Accent 3"/>
-    <w:basedOn w:val="665"/>
+    <w:basedOn w:val="893"/>
     <w:uiPriority w:val="99"/>
     <w:pPr>
       <w:pBdr/>
@@ -15120,9 +15421,9 @@
       </w:tcPr>
     </w:tblStylePr>
   </w:style>
-  <w:style w:type="table" w:styleId="72">
+  <w:style w:type="table" w:styleId="767">
     <w:name w:val="List Table 1 Light - Accent 4"/>
-    <w:basedOn w:val="665"/>
+    <w:basedOn w:val="893"/>
     <w:uiPriority w:val="99"/>
     <w:pPr>
       <w:pBdr/>
@@ -15336,9 +15637,9 @@
       </w:tcPr>
     </w:tblStylePr>
   </w:style>
-  <w:style w:type="table" w:styleId="73">
+  <w:style w:type="table" w:styleId="768">
     <w:name w:val="List Table 1 Light - Accent 5"/>
-    <w:basedOn w:val="665"/>
+    <w:basedOn w:val="893"/>
     <w:uiPriority w:val="99"/>
     <w:pPr>
       <w:pBdr/>
@@ -15552,9 +15853,9 @@
       </w:tcPr>
     </w:tblStylePr>
   </w:style>
-  <w:style w:type="table" w:styleId="74">
+  <w:style w:type="table" w:styleId="769">
     <w:name w:val="List Table 1 Light - Accent 6"/>
-    <w:basedOn w:val="665"/>
+    <w:basedOn w:val="893"/>
     <w:uiPriority w:val="99"/>
     <w:pPr>
       <w:pBdr/>
@@ -15768,9 +16069,9 @@
       </w:tcPr>
     </w:tblStylePr>
   </w:style>
-  <w:style w:type="table" w:styleId="75">
+  <w:style w:type="table" w:styleId="770">
     <w:name w:val="List Table 2"/>
-    <w:basedOn w:val="665"/>
+    <w:basedOn w:val="893"/>
     <w:uiPriority w:val="99"/>
     <w:pPr>
       <w:pBdr/>
@@ -16006,9 +16307,9 @@
       </w:tcPr>
     </w:tblStylePr>
   </w:style>
-  <w:style w:type="table" w:styleId="76">
+  <w:style w:type="table" w:styleId="771">
     <w:name w:val="List Table 2 - Accent 1"/>
-    <w:basedOn w:val="665"/>
+    <w:basedOn w:val="893"/>
     <w:uiPriority w:val="99"/>
     <w:pPr>
       <w:pBdr/>
@@ -16244,9 +16545,9 @@
       </w:tcPr>
     </w:tblStylePr>
   </w:style>
-  <w:style w:type="table" w:styleId="77">
+  <w:style w:type="table" w:styleId="772">
     <w:name w:val="List Table 2 - Accent 2"/>
-    <w:basedOn w:val="665"/>
+    <w:basedOn w:val="893"/>
     <w:uiPriority w:val="99"/>
     <w:pPr>
       <w:pBdr/>
@@ -16482,9 +16783,9 @@
       </w:tcPr>
     </w:tblStylePr>
   </w:style>
-  <w:style w:type="table" w:styleId="78">
+  <w:style w:type="table" w:styleId="773">
     <w:name w:val="List Table 2 - Accent 3"/>
-    <w:basedOn w:val="665"/>
+    <w:basedOn w:val="893"/>
     <w:uiPriority w:val="99"/>
     <w:pPr>
       <w:pBdr/>
@@ -16720,9 +17021,9 @@
       </w:tcPr>
     </w:tblStylePr>
   </w:style>
-  <w:style w:type="table" w:styleId="79">
+  <w:style w:type="table" w:styleId="774">
     <w:name w:val="List Table 2 - Accent 4"/>
-    <w:basedOn w:val="665"/>
+    <w:basedOn w:val="893"/>
     <w:uiPriority w:val="99"/>
     <w:pPr>
       <w:pBdr/>
@@ -16958,9 +17259,9 @@
       </w:tcPr>
     </w:tblStylePr>
   </w:style>
-  <w:style w:type="table" w:styleId="80">
+  <w:style w:type="table" w:styleId="775">
     <w:name w:val="List Table 2 - Accent 5"/>
-    <w:basedOn w:val="665"/>
+    <w:basedOn w:val="893"/>
     <w:uiPriority w:val="99"/>
     <w:pPr>
       <w:pBdr/>
@@ -17196,9 +17497,9 @@
       </w:tcPr>
     </w:tblStylePr>
   </w:style>
-  <w:style w:type="table" w:styleId="81">
+  <w:style w:type="table" w:styleId="776">
     <w:name w:val="List Table 2 - Accent 6"/>
-    <w:basedOn w:val="665"/>
+    <w:basedOn w:val="893"/>
     <w:uiPriority w:val="99"/>
     <w:pPr>
       <w:pBdr/>
@@ -17434,9 +17735,9 @@
       </w:tcPr>
     </w:tblStylePr>
   </w:style>
-  <w:style w:type="table" w:styleId="82">
+  <w:style w:type="table" w:styleId="777">
     <w:name w:val="List Table 3"/>
-    <w:basedOn w:val="665"/>
+    <w:basedOn w:val="893"/>
     <w:uiPriority w:val="99"/>
     <w:pPr>
       <w:pBdr/>
@@ -17662,9 +17963,9 @@
       </w:tcPr>
     </w:tblStylePr>
   </w:style>
-  <w:style w:type="table" w:styleId="83">
+  <w:style w:type="table" w:styleId="778">
     <w:name w:val="List Table 3 - Accent 1"/>
-    <w:basedOn w:val="665"/>
+    <w:basedOn w:val="893"/>
     <w:uiPriority w:val="99"/>
     <w:pPr>
       <w:pBdr/>
@@ -17890,9 +18191,9 @@
       </w:tcPr>
     </w:tblStylePr>
   </w:style>
-  <w:style w:type="table" w:styleId="84">
+  <w:style w:type="table" w:styleId="779">
     <w:name w:val="List Table 3 - Accent 2"/>
-    <w:basedOn w:val="665"/>
+    <w:basedOn w:val="893"/>
     <w:uiPriority w:val="99"/>
     <w:pPr>
       <w:pBdr/>
@@ -18118,9 +18419,9 @@
       </w:tcPr>
     </w:tblStylePr>
   </w:style>
-  <w:style w:type="table" w:styleId="85">
+  <w:style w:type="table" w:styleId="780">
     <w:name w:val="List Table 3 - Accent 3"/>
-    <w:basedOn w:val="665"/>
+    <w:basedOn w:val="893"/>
     <w:uiPriority w:val="99"/>
     <w:pPr>
       <w:pBdr/>
@@ -18346,9 +18647,9 @@
       </w:tcPr>
     </w:tblStylePr>
   </w:style>
-  <w:style w:type="table" w:styleId="86">
+  <w:style w:type="table" w:styleId="781">
     <w:name w:val="List Table 3 - Accent 4"/>
-    <w:basedOn w:val="665"/>
+    <w:basedOn w:val="893"/>
     <w:uiPriority w:val="99"/>
     <w:pPr>
       <w:pBdr/>
@@ -18574,9 +18875,9 @@
       </w:tcPr>
     </w:tblStylePr>
   </w:style>
-  <w:style w:type="table" w:styleId="87">
+  <w:style w:type="table" w:styleId="782">
     <w:name w:val="List Table 3 - Accent 5"/>
-    <w:basedOn w:val="665"/>
+    <w:basedOn w:val="893"/>
     <w:uiPriority w:val="99"/>
     <w:pPr>
       <w:pBdr/>
@@ -18802,9 +19103,9 @@
       </w:tcPr>
     </w:tblStylePr>
   </w:style>
-  <w:style w:type="table" w:styleId="88">
+  <w:style w:type="table" w:styleId="783">
     <w:name w:val="List Table 3 - Accent 6"/>
-    <w:basedOn w:val="665"/>
+    <w:basedOn w:val="893"/>
     <w:uiPriority w:val="99"/>
     <w:pPr>
       <w:pBdr/>
@@ -19030,9 +19331,9 @@
       </w:tcPr>
     </w:tblStylePr>
   </w:style>
-  <w:style w:type="table" w:styleId="89">
+  <w:style w:type="table" w:styleId="784">
     <w:name w:val="List Table 4"/>
-    <w:basedOn w:val="665"/>
+    <w:basedOn w:val="893"/>
     <w:uiPriority w:val="99"/>
     <w:pPr>
       <w:pBdr/>
@@ -19255,9 +19556,9 @@
       </w:tcPr>
     </w:tblStylePr>
   </w:style>
-  <w:style w:type="table" w:styleId="90">
+  <w:style w:type="table" w:styleId="785">
     <w:name w:val="List Table 4 - Accent 1"/>
-    <w:basedOn w:val="665"/>
+    <w:basedOn w:val="893"/>
     <w:uiPriority w:val="99"/>
     <w:pPr>
       <w:pBdr/>
@@ -19480,9 +19781,9 @@
       </w:tcPr>
     </w:tblStylePr>
   </w:style>
-  <w:style w:type="table" w:styleId="91">
+  <w:style w:type="table" w:styleId="786">
     <w:name w:val="List Table 4 - Accent 2"/>
-    <w:basedOn w:val="665"/>
+    <w:basedOn w:val="893"/>
     <w:uiPriority w:val="99"/>
     <w:pPr>
       <w:pBdr/>
@@ -19705,9 +20006,9 @@
       </w:tcPr>
     </w:tblStylePr>
   </w:style>
-  <w:style w:type="table" w:styleId="92">
+  <w:style w:type="table" w:styleId="787">
     <w:name w:val="List Table 4 - Accent 3"/>
-    <w:basedOn w:val="665"/>
+    <w:basedOn w:val="893"/>
     <w:uiPriority w:val="99"/>
     <w:pPr>
       <w:pBdr/>
@@ -19930,9 +20231,9 @@
       </w:tcPr>
     </w:tblStylePr>
   </w:style>
-  <w:style w:type="table" w:styleId="93">
+  <w:style w:type="table" w:styleId="788">
     <w:name w:val="List Table 4 - Accent 4"/>
-    <w:basedOn w:val="665"/>
+    <w:basedOn w:val="893"/>
     <w:uiPriority w:val="99"/>
     <w:pPr>
       <w:pBdr/>
@@ -20155,9 +20456,9 @@
       </w:tcPr>
     </w:tblStylePr>
   </w:style>
-  <w:style w:type="table" w:styleId="94">
+  <w:style w:type="table" w:styleId="789">
     <w:name w:val="List Table 4 - Accent 5"/>
-    <w:basedOn w:val="665"/>
+    <w:basedOn w:val="893"/>
     <w:uiPriority w:val="99"/>
     <w:pPr>
       <w:pBdr/>
@@ -20380,9 +20681,9 @@
       </w:tcPr>
     </w:tblStylePr>
   </w:style>
-  <w:style w:type="table" w:styleId="95">
+  <w:style w:type="table" w:styleId="790">
     <w:name w:val="List Table 4 - Accent 6"/>
-    <w:basedOn w:val="665"/>
+    <w:basedOn w:val="893"/>
     <w:uiPriority w:val="99"/>
     <w:pPr>
       <w:pBdr/>
@@ -20605,9 +20906,9 @@
       </w:tcPr>
     </w:tblStylePr>
   </w:style>
-  <w:style w:type="table" w:styleId="96">
+  <w:style w:type="table" w:styleId="791">
     <w:name w:val="List Table 5 Dark"/>
-    <w:basedOn w:val="665"/>
+    <w:basedOn w:val="893"/>
     <w:uiPriority w:val="99"/>
     <w:pPr>
       <w:pBdr/>
@@ -20847,9 +21148,9 @@
       </w:tcPr>
     </w:tblStylePr>
   </w:style>
-  <w:style w:type="table" w:styleId="97">
+  <w:style w:type="table" w:styleId="792">
     <w:name w:val="List Table 5 Dark - Accent 1"/>
-    <w:basedOn w:val="665"/>
+    <w:basedOn w:val="893"/>
     <w:uiPriority w:val="99"/>
     <w:pPr>
       <w:pBdr/>
@@ -21089,9 +21390,9 @@
       </w:tcPr>
     </w:tblStylePr>
   </w:style>
-  <w:style w:type="table" w:styleId="98">
+  <w:style w:type="table" w:styleId="793">
     <w:name w:val="List Table 5 Dark - Accent 2"/>
-    <w:basedOn w:val="665"/>
+    <w:basedOn w:val="893"/>
     <w:uiPriority w:val="99"/>
     <w:pPr>
       <w:pBdr/>
@@ -21331,9 +21632,9 @@
       </w:tcPr>
     </w:tblStylePr>
   </w:style>
-  <w:style w:type="table" w:styleId="99">
+  <w:style w:type="table" w:styleId="794">
     <w:name w:val="List Table 5 Dark - Accent 3"/>
-    <w:basedOn w:val="665"/>
+    <w:basedOn w:val="893"/>
     <w:uiPriority w:val="99"/>
     <w:pPr>
       <w:pBdr/>
@@ -21573,9 +21874,9 @@
       </w:tcPr>
     </w:tblStylePr>
   </w:style>
-  <w:style w:type="table" w:styleId="100">
+  <w:style w:type="table" w:styleId="795">
     <w:name w:val="List Table 5 Dark - Accent 4"/>
-    <w:basedOn w:val="665"/>
+    <w:basedOn w:val="893"/>
     <w:uiPriority w:val="99"/>
     <w:pPr>
       <w:pBdr/>
@@ -21815,9 +22116,9 @@
       </w:tcPr>
     </w:tblStylePr>
   </w:style>
-  <w:style w:type="table" w:styleId="101">
+  <w:style w:type="table" w:styleId="796">
     <w:name w:val="List Table 5 Dark - Accent 5"/>
-    <w:basedOn w:val="665"/>
+    <w:basedOn w:val="893"/>
     <w:uiPriority w:val="99"/>
     <w:pPr>
       <w:pBdr/>
@@ -22057,9 +22358,9 @@
       </w:tcPr>
     </w:tblStylePr>
   </w:style>
-  <w:style w:type="table" w:styleId="102">
+  <w:style w:type="table" w:styleId="797">
     <w:name w:val="List Table 5 Dark - Accent 6"/>
-    <w:basedOn w:val="665"/>
+    <w:basedOn w:val="893"/>
     <w:uiPriority w:val="99"/>
     <w:pPr>
       <w:pBdr/>
@@ -22299,9 +22600,9 @@
       </w:tcPr>
     </w:tblStylePr>
   </w:style>
-  <w:style w:type="table" w:styleId="103">
+  <w:style w:type="table" w:styleId="798">
     <w:name w:val="List Table 6 Colorful"/>
-    <w:basedOn w:val="665"/>
+    <w:basedOn w:val="893"/>
     <w:uiPriority w:val="99"/>
     <w:pPr>
       <w:pBdr/>
@@ -22522,9 +22823,9 @@
       </w:tcPr>
     </w:tblStylePr>
   </w:style>
-  <w:style w:type="table" w:styleId="104">
+  <w:style w:type="table" w:styleId="799">
     <w:name w:val="List Table 6 Colorful - Accent 1"/>
-    <w:basedOn w:val="665"/>
+    <w:basedOn w:val="893"/>
     <w:uiPriority w:val="99"/>
     <w:pPr>
       <w:pBdr/>
@@ -22745,9 +23046,9 @@
       </w:tcPr>
     </w:tblStylePr>
   </w:style>
-  <w:style w:type="table" w:styleId="105">
+  <w:style w:type="table" w:styleId="800">
     <w:name w:val="List Table 6 Colorful - Accent 2"/>
-    <w:basedOn w:val="665"/>
+    <w:basedOn w:val="893"/>
     <w:uiPriority w:val="99"/>
     <w:pPr>
       <w:pBdr/>
@@ -22968,9 +23269,9 @@
       </w:tcPr>
     </w:tblStylePr>
   </w:style>
-  <w:style w:type="table" w:styleId="106">
+  <w:style w:type="table" w:styleId="801">
     <w:name w:val="List Table 6 Colorful - Accent 3"/>
-    <w:basedOn w:val="665"/>
+    <w:basedOn w:val="893"/>
     <w:uiPriority w:val="99"/>
     <w:pPr>
       <w:pBdr/>
@@ -23191,9 +23492,9 @@
       </w:tcPr>
     </w:tblStylePr>
   </w:style>
-  <w:style w:type="table" w:styleId="107">
+  <w:style w:type="table" w:styleId="802">
     <w:name w:val="List Table 6 Colorful - Accent 4"/>
-    <w:basedOn w:val="665"/>
+    <w:basedOn w:val="893"/>
     <w:uiPriority w:val="99"/>
     <w:pPr>
       <w:pBdr/>
@@ -23414,9 +23715,9 @@
       </w:tcPr>
     </w:tblStylePr>
   </w:style>
-  <w:style w:type="table" w:styleId="108">
+  <w:style w:type="table" w:styleId="803">
     <w:name w:val="List Table 6 Colorful - Accent 5"/>
-    <w:basedOn w:val="665"/>
+    <w:basedOn w:val="893"/>
     <w:uiPriority w:val="99"/>
     <w:pPr>
       <w:pBdr/>
@@ -23637,9 +23938,9 @@
       </w:tcPr>
     </w:tblStylePr>
   </w:style>
-  <w:style w:type="table" w:styleId="109">
+  <w:style w:type="table" w:styleId="804">
     <w:name w:val="List Table 6 Colorful - Accent 6"/>
-    <w:basedOn w:val="665"/>
+    <w:basedOn w:val="893"/>
     <w:uiPriority w:val="99"/>
     <w:pPr>
       <w:pBdr/>
@@ -23860,9 +24161,9 @@
       </w:tcPr>
     </w:tblStylePr>
   </w:style>
-  <w:style w:type="table" w:styleId="110">
+  <w:style w:type="table" w:styleId="805">
     <w:name w:val="List Table 7 Colorful"/>
-    <w:basedOn w:val="665"/>
+    <w:basedOn w:val="893"/>
     <w:uiPriority w:val="99"/>
     <w:pPr>
       <w:pBdr/>
@@ -23961,11 +24262,11 @@
         <w:tblBorders/>
       </w:tblPr>
       <w:tcPr>
-        <w:shd w:color="ffffff"/>
+        <w:shd w:val="clear" w:color="ffffff"/>
         <w:tcBorders>
-          <w:top w:val="none"/>
-          <w:left w:val="none"/>
-          <w:bottom w:val="none"/>
+          <w:top w:val="none" w:color="000000" w:sz="4" w:space="0"/>
+          <w:left w:val="none" w:color="000000" w:sz="4" w:space="0"/>
+          <w:bottom w:val="none" w:color="000000" w:sz="4" w:space="0"/>
           <w:right w:val="single" w:color="000000" w:themeColor="text1" w:themeTint="80" w:sz="4" w:space="0"/>
         </w:tcBorders>
       </w:tcPr>
@@ -23988,10 +24289,10 @@
       <w:tcPr>
         <w:shd w:val="clear" w:color="ffffff" w:themeColor="light1" w:fill="ffffff" w:themeFill="light1"/>
         <w:tcBorders>
-          <w:top w:val="none"/>
-          <w:left w:val="none"/>
+          <w:top w:val="none" w:color="000000" w:sz="4" w:space="0"/>
+          <w:left w:val="none" w:color="000000" w:sz="4" w:space="0"/>
           <w:bottom w:val="single" w:color="000000" w:themeColor="text1" w:themeTint="80" w:sz="4" w:space="0"/>
-          <w:right w:val="none"/>
+          <w:right w:val="none" w:color="000000" w:sz="4" w:space="0"/>
         </w:tcBorders>
       </w:tcPr>
     </w:tblStylePr>
@@ -24011,12 +24312,12 @@
         <w:tblBorders/>
       </w:tblPr>
       <w:tcPr>
-        <w:shd w:color="ffffff"/>
+        <w:shd w:val="clear" w:color="ffffff"/>
         <w:tcBorders>
-          <w:top w:val="none"/>
+          <w:top w:val="none" w:color="000000" w:sz="4" w:space="0"/>
           <w:left w:val="single" w:color="000000" w:themeColor="text1" w:themeTint="80" w:sz="4" w:space="0"/>
-          <w:bottom w:val="none"/>
-          <w:right w:val="none"/>
+          <w:bottom w:val="none" w:color="000000" w:sz="4" w:space="0"/>
+          <w:right w:val="none" w:color="000000" w:sz="4" w:space="0"/>
         </w:tcBorders>
       </w:tcPr>
     </w:tblStylePr>
@@ -24039,9 +24340,9 @@
         <w:shd w:val="clear" w:color="ffffff" w:themeColor="light1" w:fill="ffffff" w:themeFill="light1"/>
         <w:tcBorders>
           <w:top w:val="single" w:color="000000" w:themeColor="text1" w:themeTint="80" w:sz="4" w:space="0"/>
-          <w:left w:val="none"/>
-          <w:bottom w:val="none"/>
-          <w:right w:val="none"/>
+          <w:left w:val="none" w:color="000000" w:sz="4" w:space="0"/>
+          <w:bottom w:val="none" w:color="000000" w:sz="4" w:space="0"/>
+          <w:right w:val="none" w:color="000000" w:sz="4" w:space="0"/>
         </w:tcBorders>
       </w:tcPr>
     </w:tblStylePr>
@@ -24116,9 +24417,9 @@
       </w:tcPr>
     </w:tblStylePr>
   </w:style>
-  <w:style w:type="table" w:styleId="111">
+  <w:style w:type="table" w:styleId="806">
     <w:name w:val="List Table 7 Colorful - Accent 1"/>
-    <w:basedOn w:val="665"/>
+    <w:basedOn w:val="893"/>
     <w:uiPriority w:val="99"/>
     <w:pPr>
       <w:pBdr/>
@@ -24217,11 +24518,11 @@
         <w:tblBorders/>
       </w:tblPr>
       <w:tcPr>
-        <w:shd w:color="ffffff"/>
+        <w:shd w:val="clear" w:color="ffffff"/>
         <w:tcBorders>
-          <w:top w:val="none"/>
-          <w:left w:val="none"/>
-          <w:bottom w:val="none"/>
+          <w:top w:val="none" w:color="000000" w:sz="4" w:space="0"/>
+          <w:left w:val="none" w:color="000000" w:sz="4" w:space="0"/>
+          <w:bottom w:val="none" w:color="000000" w:sz="4" w:space="0"/>
           <w:right w:val="single" w:color="000000" w:themeColor="accent1" w:sz="4" w:space="0"/>
         </w:tcBorders>
       </w:tcPr>
@@ -24244,10 +24545,10 @@
       <w:tcPr>
         <w:shd w:val="clear" w:color="ffffff" w:themeColor="light1" w:fill="ffffff" w:themeFill="light1"/>
         <w:tcBorders>
-          <w:top w:val="none"/>
-          <w:left w:val="none"/>
+          <w:top w:val="none" w:color="000000" w:sz="4" w:space="0"/>
+          <w:left w:val="none" w:color="000000" w:sz="4" w:space="0"/>
           <w:bottom w:val="single" w:color="000000" w:themeColor="accent1" w:sz="4" w:space="0"/>
-          <w:right w:val="none"/>
+          <w:right w:val="none" w:color="000000" w:sz="4" w:space="0"/>
         </w:tcBorders>
       </w:tcPr>
     </w:tblStylePr>
@@ -24267,12 +24568,12 @@
         <w:tblBorders/>
       </w:tblPr>
       <w:tcPr>
-        <w:shd w:color="ffffff"/>
+        <w:shd w:val="clear" w:color="ffffff"/>
         <w:tcBorders>
-          <w:top w:val="none"/>
+          <w:top w:val="none" w:color="000000" w:sz="4" w:space="0"/>
           <w:left w:val="single" w:color="000000" w:themeColor="accent1" w:sz="4" w:space="0"/>
-          <w:bottom w:val="none"/>
-          <w:right w:val="none"/>
+          <w:bottom w:val="none" w:color="000000" w:sz="4" w:space="0"/>
+          <w:right w:val="none" w:color="000000" w:sz="4" w:space="0"/>
         </w:tcBorders>
       </w:tcPr>
     </w:tblStylePr>
@@ -24295,9 +24596,9 @@
         <w:shd w:val="clear" w:color="ffffff" w:themeColor="light1" w:fill="ffffff" w:themeFill="light1"/>
         <w:tcBorders>
           <w:top w:val="single" w:color="000000" w:themeColor="accent1" w:sz="4" w:space="0"/>
-          <w:left w:val="none"/>
-          <w:bottom w:val="none"/>
-          <w:right w:val="none"/>
+          <w:left w:val="none" w:color="000000" w:sz="4" w:space="0"/>
+          <w:bottom w:val="none" w:color="000000" w:sz="4" w:space="0"/>
+          <w:right w:val="none" w:color="000000" w:sz="4" w:space="0"/>
         </w:tcBorders>
       </w:tcPr>
     </w:tblStylePr>
@@ -24372,9 +24673,9 @@
       </w:tcPr>
     </w:tblStylePr>
   </w:style>
-  <w:style w:type="table" w:styleId="112">
+  <w:style w:type="table" w:styleId="807">
     <w:name w:val="List Table 7 Colorful - Accent 2"/>
-    <w:basedOn w:val="665"/>
+    <w:basedOn w:val="893"/>
     <w:uiPriority w:val="99"/>
     <w:pPr>
       <w:pBdr/>
@@ -24473,11 +24774,11 @@
         <w:tblBorders/>
       </w:tblPr>
       <w:tcPr>
-        <w:shd w:color="ffffff"/>
+        <w:shd w:val="clear" w:color="ffffff"/>
         <w:tcBorders>
-          <w:top w:val="none"/>
-          <w:left w:val="none"/>
-          <w:bottom w:val="none"/>
+          <w:top w:val="none" w:color="000000" w:sz="4" w:space="0"/>
+          <w:left w:val="none" w:color="000000" w:sz="4" w:space="0"/>
+          <w:bottom w:val="none" w:color="000000" w:sz="4" w:space="0"/>
           <w:right w:val="single" w:color="000000" w:themeColor="accent2" w:themeTint="97" w:sz="4" w:space="0"/>
         </w:tcBorders>
       </w:tcPr>
@@ -24500,10 +24801,10 @@
       <w:tcPr>
         <w:shd w:val="clear" w:color="ffffff" w:themeColor="light1" w:fill="ffffff" w:themeFill="light1"/>
         <w:tcBorders>
-          <w:top w:val="none"/>
-          <w:left w:val="none"/>
+          <w:top w:val="none" w:color="000000" w:sz="4" w:space="0"/>
+          <w:left w:val="none" w:color="000000" w:sz="4" w:space="0"/>
           <w:bottom w:val="single" w:color="000000" w:themeColor="accent2" w:themeTint="97" w:sz="4" w:space="0"/>
-          <w:right w:val="none"/>
+          <w:right w:val="none" w:color="000000" w:sz="4" w:space="0"/>
         </w:tcBorders>
       </w:tcPr>
     </w:tblStylePr>
@@ -24523,12 +24824,12 @@
         <w:tblBorders/>
       </w:tblPr>
       <w:tcPr>
-        <w:shd w:color="ffffff"/>
+        <w:shd w:val="clear" w:color="ffffff"/>
         <w:tcBorders>
-          <w:top w:val="none"/>
+          <w:top w:val="none" w:color="000000" w:sz="4" w:space="0"/>
           <w:left w:val="single" w:color="000000" w:themeColor="accent2" w:themeTint="97" w:sz="4" w:space="0"/>
-          <w:bottom w:val="none"/>
-          <w:right w:val="none"/>
+          <w:bottom w:val="none" w:color="000000" w:sz="4" w:space="0"/>
+          <w:right w:val="none" w:color="000000" w:sz="4" w:space="0"/>
         </w:tcBorders>
       </w:tcPr>
     </w:tblStylePr>
@@ -24551,9 +24852,9 @@
         <w:shd w:val="clear" w:color="ffffff" w:themeColor="light1" w:fill="ffffff" w:themeFill="light1"/>
         <w:tcBorders>
           <w:top w:val="single" w:color="000000" w:themeColor="accent2" w:themeTint="97" w:sz="4" w:space="0"/>
-          <w:left w:val="none"/>
-          <w:bottom w:val="none"/>
-          <w:right w:val="none"/>
+          <w:left w:val="none" w:color="000000" w:sz="4" w:space="0"/>
+          <w:bottom w:val="none" w:color="000000" w:sz="4" w:space="0"/>
+          <w:right w:val="none" w:color="000000" w:sz="4" w:space="0"/>
         </w:tcBorders>
       </w:tcPr>
     </w:tblStylePr>
@@ -24628,9 +24929,9 @@
       </w:tcPr>
     </w:tblStylePr>
   </w:style>
-  <w:style w:type="table" w:styleId="113">
+  <w:style w:type="table" w:styleId="808">
     <w:name w:val="List Table 7 Colorful - Accent 3"/>
-    <w:basedOn w:val="665"/>
+    <w:basedOn w:val="893"/>
     <w:uiPriority w:val="99"/>
     <w:pPr>
       <w:pBdr/>
@@ -24729,11 +25030,11 @@
         <w:tblBorders/>
       </w:tblPr>
       <w:tcPr>
-        <w:shd w:color="ffffff"/>
+        <w:shd w:val="clear" w:color="ffffff"/>
         <w:tcBorders>
-          <w:top w:val="none"/>
-          <w:left w:val="none"/>
-          <w:bottom w:val="none"/>
+          <w:top w:val="none" w:color="000000" w:sz="4" w:space="0"/>
+          <w:left w:val="none" w:color="000000" w:sz="4" w:space="0"/>
+          <w:bottom w:val="none" w:color="000000" w:sz="4" w:space="0"/>
           <w:right w:val="single" w:color="000000" w:themeColor="accent3" w:themeTint="98" w:sz="4" w:space="0"/>
         </w:tcBorders>
       </w:tcPr>
@@ -24756,10 +25057,10 @@
       <w:tcPr>
         <w:shd w:val="clear" w:color="ffffff" w:themeColor="light1" w:fill="ffffff" w:themeFill="light1"/>
         <w:tcBorders>
-          <w:top w:val="none"/>
-          <w:left w:val="none"/>
+          <w:top w:val="none" w:color="000000" w:sz="4" w:space="0"/>
+          <w:left w:val="none" w:color="000000" w:sz="4" w:space="0"/>
           <w:bottom w:val="single" w:color="000000" w:themeColor="accent3" w:themeTint="98" w:sz="4" w:space="0"/>
-          <w:right w:val="none"/>
+          <w:right w:val="none" w:color="000000" w:sz="4" w:space="0"/>
         </w:tcBorders>
       </w:tcPr>
     </w:tblStylePr>
@@ -24779,12 +25080,12 @@
         <w:tblBorders/>
       </w:tblPr>
       <w:tcPr>
-        <w:shd w:color="ffffff"/>
+        <w:shd w:val="clear" w:color="ffffff"/>
         <w:tcBorders>
-          <w:top w:val="none"/>
+          <w:top w:val="none" w:color="000000" w:sz="4" w:space="0"/>
           <w:left w:val="single" w:color="000000" w:themeColor="accent3" w:themeTint="98" w:sz="4" w:space="0"/>
-          <w:bottom w:val="none"/>
-          <w:right w:val="none"/>
+          <w:bottom w:val="none" w:color="000000" w:sz="4" w:space="0"/>
+          <w:right w:val="none" w:color="000000" w:sz="4" w:space="0"/>
         </w:tcBorders>
       </w:tcPr>
     </w:tblStylePr>
@@ -24807,9 +25108,9 @@
         <w:shd w:val="clear" w:color="ffffff" w:themeColor="light1" w:fill="ffffff" w:themeFill="light1"/>
         <w:tcBorders>
           <w:top w:val="single" w:color="000000" w:themeColor="accent3" w:themeTint="98" w:sz="4" w:space="0"/>
-          <w:left w:val="none"/>
-          <w:bottom w:val="none"/>
-          <w:right w:val="none"/>
+          <w:left w:val="none" w:color="000000" w:sz="4" w:space="0"/>
+          <w:bottom w:val="none" w:color="000000" w:sz="4" w:space="0"/>
+          <w:right w:val="none" w:color="000000" w:sz="4" w:space="0"/>
         </w:tcBorders>
       </w:tcPr>
     </w:tblStylePr>
@@ -24884,9 +25185,9 @@
       </w:tcPr>
     </w:tblStylePr>
   </w:style>
-  <w:style w:type="table" w:styleId="114">
+  <w:style w:type="table" w:styleId="809">
     <w:name w:val="List Table 7 Colorful - Accent 4"/>
-    <w:basedOn w:val="665"/>
+    <w:basedOn w:val="893"/>
     <w:uiPriority w:val="99"/>
     <w:pPr>
       <w:pBdr/>
@@ -24985,11 +25286,11 @@
         <w:tblBorders/>
       </w:tblPr>
       <w:tcPr>
-        <w:shd w:color="ffffff"/>
+        <w:shd w:val="clear" w:color="ffffff"/>
         <w:tcBorders>
-          <w:top w:val="none"/>
-          <w:left w:val="none"/>
-          <w:bottom w:val="none"/>
+          <w:top w:val="none" w:color="000000" w:sz="4" w:space="0"/>
+          <w:left w:val="none" w:color="000000" w:sz="4" w:space="0"/>
+          <w:bottom w:val="none" w:color="000000" w:sz="4" w:space="0"/>
           <w:right w:val="single" w:color="000000" w:themeColor="accent4" w:themeTint="9A" w:sz="4" w:space="0"/>
         </w:tcBorders>
       </w:tcPr>
@@ -25012,10 +25313,10 @@
       <w:tcPr>
         <w:shd w:val="clear" w:color="ffffff" w:themeColor="light1" w:fill="ffffff" w:themeFill="light1"/>
         <w:tcBorders>
-          <w:top w:val="none"/>
-          <w:left w:val="none"/>
+          <w:top w:val="none" w:color="000000" w:sz="4" w:space="0"/>
+          <w:left w:val="none" w:color="000000" w:sz="4" w:space="0"/>
           <w:bottom w:val="single" w:color="000000" w:themeColor="accent4" w:themeTint="9A" w:sz="4" w:space="0"/>
-          <w:right w:val="none"/>
+          <w:right w:val="none" w:color="000000" w:sz="4" w:space="0"/>
         </w:tcBorders>
       </w:tcPr>
     </w:tblStylePr>
@@ -25035,12 +25336,12 @@
         <w:tblBorders/>
       </w:tblPr>
       <w:tcPr>
-        <w:shd w:color="ffffff"/>
+        <w:shd w:val="clear" w:color="ffffff"/>
         <w:tcBorders>
-          <w:top w:val="none"/>
+          <w:top w:val="none" w:color="000000" w:sz="4" w:space="0"/>
           <w:left w:val="single" w:color="000000" w:themeColor="accent4" w:themeTint="9A" w:sz="4" w:space="0"/>
-          <w:bottom w:val="none"/>
-          <w:right w:val="none"/>
+          <w:bottom w:val="none" w:color="000000" w:sz="4" w:space="0"/>
+          <w:right w:val="none" w:color="000000" w:sz="4" w:space="0"/>
         </w:tcBorders>
       </w:tcPr>
     </w:tblStylePr>
@@ -25063,9 +25364,9 @@
         <w:shd w:val="clear" w:color="ffffff" w:themeColor="light1" w:fill="ffffff" w:themeFill="light1"/>
         <w:tcBorders>
           <w:top w:val="single" w:color="000000" w:themeColor="accent4" w:themeTint="9A" w:sz="4" w:space="0"/>
-          <w:left w:val="none"/>
-          <w:bottom w:val="none"/>
-          <w:right w:val="none"/>
+          <w:left w:val="none" w:color="000000" w:sz="4" w:space="0"/>
+          <w:bottom w:val="none" w:color="000000" w:sz="4" w:space="0"/>
+          <w:right w:val="none" w:color="000000" w:sz="4" w:space="0"/>
         </w:tcBorders>
       </w:tcPr>
     </w:tblStylePr>
@@ -25140,9 +25441,9 @@
       </w:tcPr>
     </w:tblStylePr>
   </w:style>
-  <w:style w:type="table" w:styleId="115">
+  <w:style w:type="table" w:styleId="810">
     <w:name w:val="List Table 7 Colorful - Accent 5"/>
-    <w:basedOn w:val="665"/>
+    <w:basedOn w:val="893"/>
     <w:uiPriority w:val="99"/>
     <w:pPr>
       <w:pBdr/>
@@ -25241,11 +25542,11 @@
         <w:tblBorders/>
       </w:tblPr>
       <w:tcPr>
-        <w:shd w:color="ffffff"/>
+        <w:shd w:val="clear" w:color="ffffff"/>
         <w:tcBorders>
-          <w:top w:val="none"/>
-          <w:left w:val="none"/>
-          <w:bottom w:val="none"/>
+          <w:top w:val="none" w:color="000000" w:sz="4" w:space="0"/>
+          <w:left w:val="none" w:color="000000" w:sz="4" w:space="0"/>
+          <w:bottom w:val="none" w:color="000000" w:sz="4" w:space="0"/>
           <w:right w:val="single" w:color="000000" w:themeColor="accent5" w:themeTint="9A" w:sz="4" w:space="0"/>
         </w:tcBorders>
       </w:tcPr>
@@ -25268,10 +25569,10 @@
       <w:tcPr>
         <w:shd w:val="clear" w:color="ffffff" w:themeColor="light1" w:fill="ffffff" w:themeFill="light1"/>
         <w:tcBorders>
-          <w:top w:val="none"/>
-          <w:left w:val="none"/>
+          <w:top w:val="none" w:color="000000" w:sz="4" w:space="0"/>
+          <w:left w:val="none" w:color="000000" w:sz="4" w:space="0"/>
           <w:bottom w:val="single" w:color="000000" w:themeColor="accent5" w:themeTint="9A" w:sz="4" w:space="0"/>
-          <w:right w:val="none"/>
+          <w:right w:val="none" w:color="000000" w:sz="4" w:space="0"/>
         </w:tcBorders>
       </w:tcPr>
     </w:tblStylePr>
@@ -25291,12 +25592,12 @@
         <w:tblBorders/>
       </w:tblPr>
       <w:tcPr>
-        <w:shd w:color="ffffff"/>
+        <w:shd w:val="clear" w:color="ffffff"/>
         <w:tcBorders>
-          <w:top w:val="none"/>
+          <w:top w:val="none" w:color="000000" w:sz="4" w:space="0"/>
           <w:left w:val="single" w:color="000000" w:themeColor="accent5" w:themeTint="9A" w:sz="4" w:space="0"/>
-          <w:bottom w:val="none"/>
-          <w:right w:val="none"/>
+          <w:bottom w:val="none" w:color="000000" w:sz="4" w:space="0"/>
+          <w:right w:val="none" w:color="000000" w:sz="4" w:space="0"/>
         </w:tcBorders>
       </w:tcPr>
     </w:tblStylePr>
@@ -25319,9 +25620,9 @@
         <w:shd w:val="clear" w:color="ffffff" w:themeColor="light1" w:fill="ffffff" w:themeFill="light1"/>
         <w:tcBorders>
           <w:top w:val="single" w:color="000000" w:themeColor="accent5" w:themeTint="9A" w:sz="4" w:space="0"/>
-          <w:left w:val="none"/>
-          <w:bottom w:val="none"/>
-          <w:right w:val="none"/>
+          <w:left w:val="none" w:color="000000" w:sz="4" w:space="0"/>
+          <w:bottom w:val="none" w:color="000000" w:sz="4" w:space="0"/>
+          <w:right w:val="none" w:color="000000" w:sz="4" w:space="0"/>
         </w:tcBorders>
       </w:tcPr>
     </w:tblStylePr>
@@ -25396,9 +25697,9 @@
       </w:tcPr>
     </w:tblStylePr>
   </w:style>
-  <w:style w:type="table" w:styleId="116">
+  <w:style w:type="table" w:styleId="811">
     <w:name w:val="List Table 7 Colorful - Accent 6"/>
-    <w:basedOn w:val="665"/>
+    <w:basedOn w:val="893"/>
     <w:uiPriority w:val="99"/>
     <w:pPr>
       <w:pBdr/>
@@ -25497,11 +25798,11 @@
         <w:tblBorders/>
       </w:tblPr>
       <w:tcPr>
-        <w:shd w:color="ffffff"/>
+        <w:shd w:val="clear" w:color="ffffff"/>
         <w:tcBorders>
-          <w:top w:val="none"/>
-          <w:left w:val="none"/>
-          <w:bottom w:val="none"/>
+          <w:top w:val="none" w:color="000000" w:sz="4" w:space="0"/>
+          <w:left w:val="none" w:color="000000" w:sz="4" w:space="0"/>
+          <w:bottom w:val="none" w:color="000000" w:sz="4" w:space="0"/>
           <w:right w:val="single" w:color="000000" w:themeColor="accent6" w:themeTint="98" w:sz="4" w:space="0"/>
         </w:tcBorders>
       </w:tcPr>
@@ -25524,10 +25825,10 @@
       <w:tcPr>
         <w:shd w:val="clear" w:color="ffffff" w:themeColor="light1" w:fill="ffffff" w:themeFill="light1"/>
         <w:tcBorders>
-          <w:top w:val="none"/>
-          <w:left w:val="none"/>
+          <w:top w:val="none" w:color="000000" w:sz="4" w:space="0"/>
+          <w:left w:val="none" w:color="000000" w:sz="4" w:space="0"/>
           <w:bottom w:val="single" w:color="000000" w:themeColor="accent6" w:themeTint="98" w:sz="4" w:space="0"/>
-          <w:right w:val="none"/>
+          <w:right w:val="none" w:color="000000" w:sz="4" w:space="0"/>
         </w:tcBorders>
       </w:tcPr>
     </w:tblStylePr>
@@ -25547,12 +25848,12 @@
         <w:tblBorders/>
       </w:tblPr>
       <w:tcPr>
-        <w:shd w:color="ffffff"/>
+        <w:shd w:val="clear" w:color="ffffff"/>
         <w:tcBorders>
-          <w:top w:val="none"/>
+          <w:top w:val="none" w:color="000000" w:sz="4" w:space="0"/>
           <w:left w:val="single" w:color="000000" w:themeColor="accent6" w:themeTint="98" w:sz="4" w:space="0"/>
-          <w:bottom w:val="none"/>
-          <w:right w:val="none"/>
+          <w:bottom w:val="none" w:color="000000" w:sz="4" w:space="0"/>
+          <w:right w:val="none" w:color="000000" w:sz="4" w:space="0"/>
         </w:tcBorders>
       </w:tcPr>
     </w:tblStylePr>
@@ -25575,9 +25876,9 @@
         <w:shd w:val="clear" w:color="ffffff" w:themeColor="light1" w:fill="ffffff" w:themeFill="light1"/>
         <w:tcBorders>
           <w:top w:val="single" w:color="000000" w:themeColor="accent6" w:themeTint="98" w:sz="4" w:space="0"/>
-          <w:left w:val="none"/>
-          <w:bottom w:val="none"/>
-          <w:right w:val="none"/>
+          <w:left w:val="none" w:color="000000" w:sz="4" w:space="0"/>
+          <w:bottom w:val="none" w:color="000000" w:sz="4" w:space="0"/>
+          <w:right w:val="none" w:color="000000" w:sz="4" w:space="0"/>
         </w:tcBorders>
       </w:tcPr>
     </w:tblStylePr>
@@ -25652,9 +25953,9 @@
       </w:tcPr>
     </w:tblStylePr>
   </w:style>
-  <w:style w:type="table" w:styleId="117">
+  <w:style w:type="table" w:styleId="812">
     <w:name w:val="Lined - Accent"/>
-    <w:basedOn w:val="665"/>
+    <w:basedOn w:val="893"/>
     <w:uiPriority w:val="99"/>
     <w:pPr>
       <w:pBdr/>
@@ -25889,9 +26190,9 @@
       </w:tcPr>
     </w:tblStylePr>
   </w:style>
-  <w:style w:type="table" w:styleId="118">
+  <w:style w:type="table" w:styleId="813">
     <w:name w:val="Lined - Accent 1"/>
-    <w:basedOn w:val="665"/>
+    <w:basedOn w:val="893"/>
     <w:uiPriority w:val="99"/>
     <w:pPr>
       <w:pBdr/>
@@ -26126,9 +26427,9 @@
       </w:tcPr>
     </w:tblStylePr>
   </w:style>
-  <w:style w:type="table" w:styleId="119">
+  <w:style w:type="table" w:styleId="814">
     <w:name w:val="Lined - Accent 2"/>
-    <w:basedOn w:val="665"/>
+    <w:basedOn w:val="893"/>
     <w:uiPriority w:val="99"/>
     <w:pPr>
       <w:pBdr/>
@@ -26363,9 +26664,9 @@
       </w:tcPr>
     </w:tblStylePr>
   </w:style>
-  <w:style w:type="table" w:styleId="120">
+  <w:style w:type="table" w:styleId="815">
     <w:name w:val="Lined - Accent 3"/>
-    <w:basedOn w:val="665"/>
+    <w:basedOn w:val="893"/>
     <w:uiPriority w:val="99"/>
     <w:pPr>
       <w:pBdr/>
@@ -26600,9 +26901,9 @@
       </w:tcPr>
     </w:tblStylePr>
   </w:style>
-  <w:style w:type="table" w:styleId="121">
+  <w:style w:type="table" w:styleId="816">
     <w:name w:val="Lined - Accent 4"/>
-    <w:basedOn w:val="665"/>
+    <w:basedOn w:val="893"/>
     <w:uiPriority w:val="99"/>
     <w:pPr>
       <w:pBdr/>
@@ -26837,9 +27138,9 @@
       </w:tcPr>
     </w:tblStylePr>
   </w:style>
-  <w:style w:type="table" w:styleId="122">
+  <w:style w:type="table" w:styleId="817">
     <w:name w:val="Lined - Accent 5"/>
-    <w:basedOn w:val="665"/>
+    <w:basedOn w:val="893"/>
     <w:uiPriority w:val="99"/>
     <w:pPr>
       <w:pBdr/>
@@ -27074,9 +27375,9 @@
       </w:tcPr>
     </w:tblStylePr>
   </w:style>
-  <w:style w:type="table" w:styleId="123">
+  <w:style w:type="table" w:styleId="818">
     <w:name w:val="Lined - Accent 6"/>
-    <w:basedOn w:val="665"/>
+    <w:basedOn w:val="893"/>
     <w:uiPriority w:val="99"/>
     <w:pPr>
       <w:pBdr/>
@@ -27311,9 +27612,9 @@
       </w:tcPr>
     </w:tblStylePr>
   </w:style>
-  <w:style w:type="table" w:styleId="124">
+  <w:style w:type="table" w:styleId="819">
     <w:name w:val="Bordered &amp; Lined - Accent"/>
-    <w:basedOn w:val="665"/>
+    <w:basedOn w:val="893"/>
     <w:uiPriority w:val="99"/>
     <w:pPr>
       <w:pBdr/>
@@ -27555,9 +27856,9 @@
       </w:tcPr>
     </w:tblStylePr>
   </w:style>
-  <w:style w:type="table" w:styleId="125">
+  <w:style w:type="table" w:styleId="820">
     <w:name w:val="Bordered &amp; Lined - Accent 1"/>
-    <w:basedOn w:val="665"/>
+    <w:basedOn w:val="893"/>
     <w:uiPriority w:val="99"/>
     <w:pPr>
       <w:pBdr/>
@@ -27799,9 +28100,9 @@
       </w:tcPr>
     </w:tblStylePr>
   </w:style>
-  <w:style w:type="table" w:styleId="126">
+  <w:style w:type="table" w:styleId="821">
     <w:name w:val="Bordered &amp; Lined - Accent 2"/>
-    <w:basedOn w:val="665"/>
+    <w:basedOn w:val="893"/>
     <w:uiPriority w:val="99"/>
     <w:pPr>
       <w:pBdr/>
@@ -28043,9 +28344,9 @@
       </w:tcPr>
     </w:tblStylePr>
   </w:style>
-  <w:style w:type="table" w:styleId="127">
+  <w:style w:type="table" w:styleId="822">
     <w:name w:val="Bordered &amp; Lined - Accent 3"/>
-    <w:basedOn w:val="665"/>
+    <w:basedOn w:val="893"/>
     <w:uiPriority w:val="99"/>
     <w:pPr>
       <w:pBdr/>
@@ -28287,9 +28588,9 @@
       </w:tcPr>
     </w:tblStylePr>
   </w:style>
-  <w:style w:type="table" w:styleId="128">
+  <w:style w:type="table" w:styleId="823">
     <w:name w:val="Bordered &amp; Lined - Accent 4"/>
-    <w:basedOn w:val="665"/>
+    <w:basedOn w:val="893"/>
     <w:uiPriority w:val="99"/>
     <w:pPr>
       <w:pBdr/>
@@ -28531,9 +28832,9 @@
       </w:tcPr>
     </w:tblStylePr>
   </w:style>
-  <w:style w:type="table" w:styleId="129">
+  <w:style w:type="table" w:styleId="824">
     <w:name w:val="Bordered &amp; Lined - Accent 5"/>
-    <w:basedOn w:val="665"/>
+    <w:basedOn w:val="893"/>
     <w:uiPriority w:val="99"/>
     <w:pPr>
       <w:pBdr/>
@@ -28775,9 +29076,9 @@
       </w:tcPr>
     </w:tblStylePr>
   </w:style>
-  <w:style w:type="table" w:styleId="130">
+  <w:style w:type="table" w:styleId="825">
     <w:name w:val="Bordered &amp; Lined - Accent 6"/>
-    <w:basedOn w:val="665"/>
+    <w:basedOn w:val="893"/>
     <w:uiPriority w:val="99"/>
     <w:pPr>
       <w:pBdr/>
@@ -29019,9 +29320,9 @@
       </w:tcPr>
     </w:tblStylePr>
   </w:style>
-  <w:style w:type="table" w:styleId="131">
+  <w:style w:type="table" w:styleId="826">
     <w:name w:val="Bordered"/>
-    <w:basedOn w:val="665"/>
+    <w:basedOn w:val="893"/>
     <w:uiPriority w:val="99"/>
     <w:pPr>
       <w:pBdr/>
@@ -29250,9 +29551,9 @@
       </w:tcPr>
     </w:tblStylePr>
   </w:style>
-  <w:style w:type="table" w:styleId="132">
+  <w:style w:type="table" w:styleId="827">
     <w:name w:val="Bordered - Accent 1"/>
-    <w:basedOn w:val="665"/>
+    <w:basedOn w:val="893"/>
     <w:uiPriority w:val="99"/>
     <w:pPr>
       <w:pBdr/>
@@ -29481,9 +29782,9 @@
       </w:tcPr>
     </w:tblStylePr>
   </w:style>
-  <w:style w:type="table" w:styleId="133">
+  <w:style w:type="table" w:styleId="828">
     <w:name w:val="Bordered - Accent 2"/>
-    <w:basedOn w:val="665"/>
+    <w:basedOn w:val="893"/>
     <w:uiPriority w:val="99"/>
     <w:pPr>
       <w:pBdr/>
@@ -29712,9 +30013,9 @@
       </w:tcPr>
     </w:tblStylePr>
   </w:style>
-  <w:style w:type="table" w:styleId="134">
+  <w:style w:type="table" w:styleId="829">
     <w:name w:val="Bordered - Accent 3"/>
-    <w:basedOn w:val="665"/>
+    <w:basedOn w:val="893"/>
     <w:uiPriority w:val="99"/>
     <w:pPr>
       <w:pBdr/>
@@ -29943,9 +30244,9 @@
       </w:tcPr>
     </w:tblStylePr>
   </w:style>
-  <w:style w:type="table" w:styleId="135">
+  <w:style w:type="table" w:styleId="830">
     <w:name w:val="Bordered - Accent 4"/>
-    <w:basedOn w:val="665"/>
+    <w:basedOn w:val="893"/>
     <w:uiPriority w:val="99"/>
     <w:pPr>
       <w:pBdr/>
@@ -30174,9 +30475,9 @@
       </w:tcPr>
     </w:tblStylePr>
   </w:style>
-  <w:style w:type="table" w:styleId="136">
+  <w:style w:type="table" w:styleId="831">
     <w:name w:val="Bordered - Accent 5"/>
-    <w:basedOn w:val="665"/>
+    <w:basedOn w:val="893"/>
     <w:uiPriority w:val="99"/>
     <w:pPr>
       <w:pBdr/>
@@ -30405,9 +30706,9 @@
       </w:tcPr>
     </w:tblStylePr>
   </w:style>
-  <w:style w:type="table" w:styleId="137">
+  <w:style w:type="table" w:styleId="832">
     <w:name w:val="Bordered - Accent 6"/>
-    <w:basedOn w:val="665"/>
+    <w:basedOn w:val="893"/>
     <w:uiPriority w:val="99"/>
     <w:pPr>
       <w:pBdr/>
@@ -30636,11 +30937,11 @@
       </w:tcPr>
     </w:tblStylePr>
   </w:style>
-  <w:style w:type="paragraph" w:styleId="139">
+  <w:style w:type="paragraph" w:styleId="833">
     <w:name w:val="Heading 1"/>
-    <w:basedOn w:val="664"/>
-    <w:next w:val="664"/>
-    <w:link w:val="150"/>
+    <w:basedOn w:val="892"/>
+    <w:next w:val="892"/>
+    <w:link w:val="843"/>
     <w:uiPriority w:val="9"/>
     <w:qFormat/>
     <w:pPr>
@@ -30658,11 +30959,11 @@
       <w:szCs w:val="40"/>
     </w:rPr>
   </w:style>
-  <w:style w:type="paragraph" w:styleId="140">
+  <w:style w:type="paragraph" w:styleId="834">
     <w:name w:val="Heading 2"/>
-    <w:basedOn w:val="664"/>
-    <w:next w:val="664"/>
-    <w:link w:val="151"/>
+    <w:basedOn w:val="892"/>
+    <w:next w:val="892"/>
+    <w:link w:val="844"/>
     <w:uiPriority w:val="9"/>
     <w:unhideWhenUsed/>
     <w:qFormat/>
@@ -30681,11 +30982,11 @@
       <w:szCs w:val="32"/>
     </w:rPr>
   </w:style>
-  <w:style w:type="paragraph" w:styleId="141">
+  <w:style w:type="paragraph" w:styleId="835">
     <w:name w:val="Heading 3"/>
-    <w:basedOn w:val="664"/>
-    <w:next w:val="664"/>
-    <w:link w:val="152"/>
+    <w:basedOn w:val="892"/>
+    <w:next w:val="892"/>
+    <w:link w:val="845"/>
     <w:uiPriority w:val="9"/>
     <w:unhideWhenUsed/>
     <w:qFormat/>
@@ -30704,11 +31005,11 @@
       <w:szCs w:val="28"/>
     </w:rPr>
   </w:style>
-  <w:style w:type="paragraph" w:styleId="142">
+  <w:style w:type="paragraph" w:styleId="836">
     <w:name w:val="Heading 4"/>
-    <w:basedOn w:val="664"/>
-    <w:next w:val="664"/>
-    <w:link w:val="153"/>
+    <w:basedOn w:val="892"/>
+    <w:next w:val="892"/>
+    <w:link w:val="846"/>
     <w:uiPriority w:val="9"/>
     <w:unhideWhenUsed/>
     <w:qFormat/>
@@ -30727,11 +31028,11 @@
       <w:color w:val="0f4761" w:themeColor="accent1" w:themeShade="BF"/>
     </w:rPr>
   </w:style>
-  <w:style w:type="paragraph" w:styleId="143">
+  <w:style w:type="paragraph" w:styleId="837">
     <w:name w:val="Heading 5"/>
-    <w:basedOn w:val="664"/>
-    <w:next w:val="664"/>
-    <w:link w:val="154"/>
+    <w:basedOn w:val="892"/>
+    <w:next w:val="892"/>
+    <w:link w:val="847"/>
     <w:uiPriority w:val="9"/>
     <w:unhideWhenUsed/>
     <w:qFormat/>
@@ -30748,11 +31049,11 @@
       <w:color w:val="0f4761" w:themeColor="accent1" w:themeShade="BF"/>
     </w:rPr>
   </w:style>
-  <w:style w:type="paragraph" w:styleId="144">
+  <w:style w:type="paragraph" w:styleId="838">
     <w:name w:val="Heading 6"/>
-    <w:basedOn w:val="664"/>
-    <w:next w:val="664"/>
-    <w:link w:val="155"/>
+    <w:basedOn w:val="892"/>
+    <w:next w:val="892"/>
+    <w:link w:val="848"/>
     <w:uiPriority w:val="9"/>
     <w:unhideWhenUsed/>
     <w:qFormat/>
@@ -30771,11 +31072,11 @@
       <w:color w:val="595959" w:themeColor="text1" w:themeTint="A6"/>
     </w:rPr>
   </w:style>
-  <w:style w:type="paragraph" w:styleId="145">
+  <w:style w:type="paragraph" w:styleId="839">
     <w:name w:val="Heading 7"/>
-    <w:basedOn w:val="664"/>
-    <w:next w:val="664"/>
-    <w:link w:val="156"/>
+    <w:basedOn w:val="892"/>
+    <w:next w:val="892"/>
+    <w:link w:val="849"/>
     <w:uiPriority w:val="9"/>
     <w:unhideWhenUsed/>
     <w:qFormat/>
@@ -30792,11 +31093,11 @@
       <w:color w:val="595959" w:themeColor="text1" w:themeTint="A6"/>
     </w:rPr>
   </w:style>
-  <w:style w:type="paragraph" w:styleId="146">
+  <w:style w:type="paragraph" w:styleId="840">
     <w:name w:val="Heading 8"/>
-    <w:basedOn w:val="664"/>
-    <w:next w:val="664"/>
-    <w:link w:val="157"/>
+    <w:basedOn w:val="892"/>
+    <w:next w:val="892"/>
+    <w:link w:val="850"/>
     <w:uiPriority w:val="9"/>
     <w:unhideWhenUsed/>
     <w:qFormat/>
@@ -30815,11 +31116,11 @@
       <w:color w:val="272727" w:themeColor="text1" w:themeTint="D8"/>
     </w:rPr>
   </w:style>
-  <w:style w:type="paragraph" w:styleId="147">
+  <w:style w:type="paragraph" w:styleId="841">
     <w:name w:val="Heading 9"/>
-    <w:basedOn w:val="664"/>
-    <w:next w:val="664"/>
-    <w:link w:val="158"/>
+    <w:basedOn w:val="892"/>
+    <w:next w:val="892"/>
+    <w:link w:val="851"/>
     <w:uiPriority w:val="9"/>
     <w:unhideWhenUsed/>
     <w:qFormat/>
@@ -30838,7 +31139,7 @@
       <w:color w:val="272727" w:themeColor="text1" w:themeTint="D8"/>
     </w:rPr>
   </w:style>
-  <w:style w:type="character" w:styleId="148" w:default="1">
+  <w:style w:type="character" w:styleId="842" w:default="1">
     <w:name w:val="Default Paragraph Font"/>
     <w:uiPriority w:val="1"/>
     <w:semiHidden/>
@@ -30849,10 +31150,10 @@
       <w:ind/>
     </w:pPr>
   </w:style>
-  <w:style w:type="character" w:styleId="150">
+  <w:style w:type="character" w:styleId="843">
     <w:name w:val="Heading 1 Char"/>
-    <w:basedOn w:val="148"/>
-    <w:link w:val="139"/>
+    <w:basedOn w:val="842"/>
+    <w:link w:val="833"/>
     <w:uiPriority w:val="9"/>
     <w:pPr>
       <w:pBdr/>
@@ -30866,10 +31167,10 @@
       <w:szCs w:val="40"/>
     </w:rPr>
   </w:style>
-  <w:style w:type="character" w:styleId="151">
+  <w:style w:type="character" w:styleId="844">
     <w:name w:val="Heading 2 Char"/>
-    <w:basedOn w:val="148"/>
-    <w:link w:val="140"/>
+    <w:basedOn w:val="842"/>
+    <w:link w:val="834"/>
     <w:uiPriority w:val="9"/>
     <w:pPr>
       <w:pBdr/>
@@ -30883,10 +31184,10 @@
       <w:szCs w:val="32"/>
     </w:rPr>
   </w:style>
-  <w:style w:type="character" w:styleId="152">
+  <w:style w:type="character" w:styleId="845">
     <w:name w:val="Heading 3 Char"/>
-    <w:basedOn w:val="148"/>
-    <w:link w:val="141"/>
+    <w:basedOn w:val="842"/>
+    <w:link w:val="835"/>
     <w:uiPriority w:val="9"/>
     <w:pPr>
       <w:pBdr/>
@@ -30900,10 +31201,10 @@
       <w:szCs w:val="28"/>
     </w:rPr>
   </w:style>
-  <w:style w:type="character" w:styleId="153">
+  <w:style w:type="character" w:styleId="846">
     <w:name w:val="Heading 4 Char"/>
-    <w:basedOn w:val="148"/>
-    <w:link w:val="142"/>
+    <w:basedOn w:val="842"/>
+    <w:link w:val="836"/>
     <w:uiPriority w:val="9"/>
     <w:pPr>
       <w:pBdr/>
@@ -30917,10 +31218,10 @@
       <w:color w:val="0f4761" w:themeColor="accent1" w:themeShade="BF"/>
     </w:rPr>
   </w:style>
-  <w:style w:type="character" w:styleId="154">
+  <w:style w:type="character" w:styleId="847">
     <w:name w:val="Heading 5 Char"/>
-    <w:basedOn w:val="148"/>
-    <w:link w:val="143"/>
+    <w:basedOn w:val="842"/>
+    <w:link w:val="837"/>
     <w:uiPriority w:val="9"/>
     <w:pPr>
       <w:pBdr/>
@@ -30932,10 +31233,10 @@
       <w:color w:val="0f4761" w:themeColor="accent1" w:themeShade="BF"/>
     </w:rPr>
   </w:style>
-  <w:style w:type="character" w:styleId="155">
+  <w:style w:type="character" w:styleId="848">
     <w:name w:val="Heading 6 Char"/>
-    <w:basedOn w:val="148"/>
-    <w:link w:val="144"/>
+    <w:basedOn w:val="842"/>
+    <w:link w:val="838"/>
     <w:uiPriority w:val="9"/>
     <w:pPr>
       <w:pBdr/>
@@ -30949,10 +31250,10 @@
       <w:color w:val="595959" w:themeColor="text1" w:themeTint="A6"/>
     </w:rPr>
   </w:style>
-  <w:style w:type="character" w:styleId="156">
+  <w:style w:type="character" w:styleId="849">
     <w:name w:val="Heading 7 Char"/>
-    <w:basedOn w:val="148"/>
-    <w:link w:val="145"/>
+    <w:basedOn w:val="842"/>
+    <w:link w:val="839"/>
     <w:uiPriority w:val="9"/>
     <w:pPr>
       <w:pBdr/>
@@ -30964,10 +31265,10 @@
       <w:color w:val="595959" w:themeColor="text1" w:themeTint="A6"/>
     </w:rPr>
   </w:style>
-  <w:style w:type="character" w:styleId="157">
+  <w:style w:type="character" w:styleId="850">
     <w:name w:val="Heading 8 Char"/>
-    <w:basedOn w:val="148"/>
-    <w:link w:val="146"/>
+    <w:basedOn w:val="842"/>
+    <w:link w:val="840"/>
     <w:uiPriority w:val="9"/>
     <w:pPr>
       <w:pBdr/>
@@ -30981,10 +31282,10 @@
       <w:color w:val="272727" w:themeColor="text1" w:themeTint="D8"/>
     </w:rPr>
   </w:style>
-  <w:style w:type="character" w:styleId="158">
+  <w:style w:type="character" w:styleId="851">
     <w:name w:val="Heading 9 Char"/>
-    <w:basedOn w:val="148"/>
-    <w:link w:val="147"/>
+    <w:basedOn w:val="842"/>
+    <w:link w:val="841"/>
     <w:uiPriority w:val="9"/>
     <w:pPr>
       <w:pBdr/>
@@ -30998,11 +31299,11 @@
       <w:color w:val="272727" w:themeColor="text1" w:themeTint="D8"/>
     </w:rPr>
   </w:style>
-  <w:style w:type="paragraph" w:styleId="159">
+  <w:style w:type="paragraph" w:styleId="852">
     <w:name w:val="Title"/>
-    <w:basedOn w:val="664"/>
-    <w:next w:val="664"/>
-    <w:link w:val="160"/>
+    <w:basedOn w:val="892"/>
+    <w:next w:val="892"/>
+    <w:link w:val="853"/>
     <w:uiPriority w:val="10"/>
     <w:qFormat/>
     <w:pPr>
@@ -31018,10 +31319,10 @@
       <w:szCs w:val="56"/>
     </w:rPr>
   </w:style>
-  <w:style w:type="character" w:styleId="160">
+  <w:style w:type="character" w:styleId="853">
     <w:name w:val="Title Char"/>
-    <w:basedOn w:val="148"/>
-    <w:link w:val="159"/>
+    <w:basedOn w:val="842"/>
+    <w:link w:val="852"/>
     <w:uiPriority w:val="10"/>
     <w:pPr>
       <w:pBdr/>
@@ -31035,11 +31336,11 @@
       <w:szCs w:val="56"/>
     </w:rPr>
   </w:style>
-  <w:style w:type="paragraph" w:styleId="161">
+  <w:style w:type="paragraph" w:styleId="854">
     <w:name w:val="Subtitle"/>
-    <w:basedOn w:val="664"/>
-    <w:next w:val="664"/>
-    <w:link w:val="162"/>
+    <w:basedOn w:val="892"/>
+    <w:next w:val="892"/>
+    <w:link w:val="855"/>
     <w:uiPriority w:val="11"/>
     <w:qFormat/>
     <w:pPr>
@@ -31057,10 +31358,10 @@
       <w:szCs w:val="28"/>
     </w:rPr>
   </w:style>
-  <w:style w:type="character" w:styleId="162">
+  <w:style w:type="character" w:styleId="855">
     <w:name w:val="Subtitle Char"/>
-    <w:basedOn w:val="148"/>
-    <w:link w:val="161"/>
+    <w:basedOn w:val="842"/>
+    <w:link w:val="854"/>
     <w:uiPriority w:val="11"/>
     <w:pPr>
       <w:pBdr/>
@@ -31074,11 +31375,11 @@
       <w:szCs w:val="28"/>
     </w:rPr>
   </w:style>
-  <w:style w:type="paragraph" w:styleId="163">
+  <w:style w:type="paragraph" w:styleId="856">
     <w:name w:val="Quote"/>
-    <w:basedOn w:val="664"/>
-    <w:next w:val="664"/>
-    <w:link w:val="164"/>
+    <w:basedOn w:val="892"/>
+    <w:next w:val="892"/>
+    <w:link w:val="857"/>
     <w:uiPriority w:val="29"/>
     <w:qFormat/>
     <w:pPr>
@@ -31093,10 +31394,10 @@
       <w:color w:val="404040" w:themeColor="text1" w:themeTint="BF"/>
     </w:rPr>
   </w:style>
-  <w:style w:type="character" w:styleId="164">
+  <w:style w:type="character" w:styleId="857">
     <w:name w:val="Quote Char"/>
-    <w:basedOn w:val="148"/>
-    <w:link w:val="163"/>
+    <w:basedOn w:val="842"/>
+    <w:link w:val="856"/>
     <w:uiPriority w:val="29"/>
     <w:pPr>
       <w:pBdr/>
@@ -31109,9 +31410,9 @@
       <w:color w:val="404040" w:themeColor="text1" w:themeTint="BF"/>
     </w:rPr>
   </w:style>
-  <w:style w:type="character" w:styleId="166">
+  <w:style w:type="character" w:styleId="858">
     <w:name w:val="Intense Emphasis"/>
-    <w:basedOn w:val="148"/>
+    <w:basedOn w:val="842"/>
     <w:uiPriority w:val="21"/>
     <w:qFormat/>
     <w:pPr>
@@ -31125,11 +31426,11 @@
       <w:color w:val="0f4761" w:themeColor="accent1" w:themeShade="BF"/>
     </w:rPr>
   </w:style>
-  <w:style w:type="paragraph" w:styleId="167">
+  <w:style w:type="paragraph" w:styleId="859">
     <w:name w:val="Intense Quote"/>
-    <w:basedOn w:val="664"/>
-    <w:next w:val="664"/>
-    <w:link w:val="168"/>
+    <w:basedOn w:val="892"/>
+    <w:next w:val="892"/>
+    <w:link w:val="860"/>
     <w:uiPriority w:val="30"/>
     <w:qFormat/>
     <w:pPr>
@@ -31147,10 +31448,10 @@
       <w:color w:val="0f4761" w:themeColor="accent1" w:themeShade="BF"/>
     </w:rPr>
   </w:style>
-  <w:style w:type="character" w:styleId="168">
+  <w:style w:type="character" w:styleId="860">
     <w:name w:val="Intense Quote Char"/>
-    <w:basedOn w:val="148"/>
-    <w:link w:val="167"/>
+    <w:basedOn w:val="842"/>
+    <w:link w:val="859"/>
     <w:uiPriority w:val="30"/>
     <w:pPr>
       <w:pBdr/>
@@ -31163,9 +31464,9 @@
       <w:color w:val="0f4761" w:themeColor="accent1" w:themeShade="BF"/>
     </w:rPr>
   </w:style>
-  <w:style w:type="character" w:styleId="169">
+  <w:style w:type="character" w:styleId="861">
     <w:name w:val="Intense Reference"/>
-    <w:basedOn w:val="148"/>
+    <w:basedOn w:val="842"/>
     <w:uiPriority w:val="32"/>
     <w:qFormat/>
     <w:pPr>
@@ -31181,9 +31482,9 @@
       <w:spacing w:val="5"/>
     </w:rPr>
   </w:style>
-  <w:style w:type="character" w:styleId="171">
+  <w:style w:type="character" w:styleId="862">
     <w:name w:val="Subtle Emphasis"/>
-    <w:basedOn w:val="148"/>
+    <w:basedOn w:val="842"/>
     <w:uiPriority w:val="19"/>
     <w:qFormat/>
     <w:pPr>
@@ -31197,9 +31498,9 @@
       <w:color w:val="404040" w:themeColor="text1" w:themeTint="BF"/>
     </w:rPr>
   </w:style>
-  <w:style w:type="character" w:styleId="172">
+  <w:style w:type="character" w:styleId="863">
     <w:name w:val="Emphasis"/>
-    <w:basedOn w:val="148"/>
+    <w:basedOn w:val="842"/>
     <w:uiPriority w:val="20"/>
     <w:qFormat/>
     <w:pPr>
@@ -31212,9 +31513,9 @@
       <w:iCs/>
     </w:rPr>
   </w:style>
-  <w:style w:type="character" w:styleId="173">
+  <w:style w:type="character" w:styleId="864">
     <w:name w:val="Strong"/>
-    <w:basedOn w:val="148"/>
+    <w:basedOn w:val="842"/>
     <w:uiPriority w:val="22"/>
     <w:qFormat/>
     <w:pPr>
@@ -31227,9 +31528,9 @@
       <w:bCs/>
     </w:rPr>
   </w:style>
-  <w:style w:type="character" w:styleId="174">
+  <w:style w:type="character" w:styleId="865">
     <w:name w:val="Subtle Reference"/>
-    <w:basedOn w:val="148"/>
+    <w:basedOn w:val="842"/>
     <w:uiPriority w:val="31"/>
     <w:qFormat/>
     <w:pPr>
@@ -31242,9 +31543,9 @@
       <w:color w:val="5a5a5a" w:themeColor="text1" w:themeTint="A5"/>
     </w:rPr>
   </w:style>
-  <w:style w:type="character" w:styleId="175">
+  <w:style w:type="character" w:styleId="866">
     <w:name w:val="Book Title"/>
-    <w:basedOn w:val="148"/>
+    <w:basedOn w:val="842"/>
     <w:uiPriority w:val="33"/>
     <w:qFormat/>
     <w:pPr>
@@ -31260,10 +31561,10 @@
       <w:spacing w:val="5"/>
     </w:rPr>
   </w:style>
-  <w:style w:type="paragraph" w:styleId="176">
+  <w:style w:type="paragraph" w:styleId="867">
     <w:name w:val="Header"/>
-    <w:basedOn w:val="664"/>
-    <w:link w:val="177"/>
+    <w:basedOn w:val="892"/>
+    <w:link w:val="868"/>
     <w:uiPriority w:val="99"/>
     <w:unhideWhenUsed/>
     <w:pPr>
@@ -31276,10 +31577,10 @@
       <w:ind/>
     </w:pPr>
   </w:style>
-  <w:style w:type="character" w:styleId="177">
+  <w:style w:type="character" w:styleId="868">
     <w:name w:val="Header Char"/>
-    <w:basedOn w:val="148"/>
-    <w:link w:val="176"/>
+    <w:basedOn w:val="842"/>
+    <w:link w:val="867"/>
     <w:uiPriority w:val="99"/>
     <w:pPr>
       <w:pBdr/>
@@ -31287,10 +31588,10 @@
       <w:ind/>
     </w:pPr>
   </w:style>
-  <w:style w:type="paragraph" w:styleId="178">
+  <w:style w:type="paragraph" w:styleId="869">
     <w:name w:val="Footer"/>
-    <w:basedOn w:val="664"/>
-    <w:link w:val="179"/>
+    <w:basedOn w:val="892"/>
+    <w:link w:val="870"/>
     <w:uiPriority w:val="99"/>
     <w:unhideWhenUsed/>
     <w:pPr>
@@ -31303,10 +31604,10 @@
       <w:ind/>
     </w:pPr>
   </w:style>
-  <w:style w:type="character" w:styleId="179">
+  <w:style w:type="character" w:styleId="870">
     <w:name w:val="Footer Char"/>
-    <w:basedOn w:val="148"/>
-    <w:link w:val="178"/>
+    <w:basedOn w:val="842"/>
+    <w:link w:val="869"/>
     <w:uiPriority w:val="99"/>
     <w:pPr>
       <w:pBdr/>
@@ -31314,10 +31615,10 @@
       <w:ind/>
     </w:pPr>
   </w:style>
-  <w:style w:type="paragraph" w:styleId="180">
+  <w:style w:type="paragraph" w:styleId="871">
     <w:name w:val="Caption"/>
-    <w:basedOn w:val="664"/>
-    <w:next w:val="664"/>
+    <w:basedOn w:val="892"/>
+    <w:next w:val="892"/>
     <w:uiPriority w:val="35"/>
     <w:unhideWhenUsed/>
     <w:qFormat/>
@@ -31334,10 +31635,10 @@
       <w:szCs w:val="18"/>
     </w:rPr>
   </w:style>
-  <w:style w:type="paragraph" w:styleId="181">
+  <w:style w:type="paragraph" w:styleId="872">
     <w:name w:val="footnote text"/>
-    <w:basedOn w:val="664"/>
-    <w:link w:val="182"/>
+    <w:basedOn w:val="892"/>
+    <w:link w:val="873"/>
     <w:uiPriority w:val="99"/>
     <w:semiHidden/>
     <w:unhideWhenUsed/>
@@ -31351,10 +31652,10 @@
       <w:szCs w:val="20"/>
     </w:rPr>
   </w:style>
-  <w:style w:type="character" w:styleId="182">
+  <w:style w:type="character" w:styleId="873">
     <w:name w:val="Footnote Text Char"/>
-    <w:basedOn w:val="148"/>
-    <w:link w:val="181"/>
+    <w:basedOn w:val="842"/>
+    <w:link w:val="872"/>
     <w:uiPriority w:val="99"/>
     <w:semiHidden/>
     <w:pPr>
@@ -31367,9 +31668,9 @@
       <w:szCs w:val="20"/>
     </w:rPr>
   </w:style>
-  <w:style w:type="character" w:styleId="183">
+  <w:style w:type="character" w:styleId="874">
     <w:name w:val="footnote reference"/>
-    <w:basedOn w:val="148"/>
+    <w:basedOn w:val="842"/>
     <w:uiPriority w:val="99"/>
     <w:semiHidden/>
     <w:unhideWhenUsed/>
@@ -31382,10 +31683,10 @@
       <w:vertAlign w:val="superscript"/>
     </w:rPr>
   </w:style>
-  <w:style w:type="paragraph" w:styleId="184">
+  <w:style w:type="paragraph" w:styleId="875">
     <w:name w:val="endnote text"/>
-    <w:basedOn w:val="664"/>
-    <w:link w:val="185"/>
+    <w:basedOn w:val="892"/>
+    <w:link w:val="876"/>
     <w:uiPriority w:val="99"/>
     <w:semiHidden/>
     <w:unhideWhenUsed/>
@@ -31399,10 +31700,10 @@
       <w:szCs w:val="20"/>
     </w:rPr>
   </w:style>
-  <w:style w:type="character" w:styleId="185">
+  <w:style w:type="character" w:styleId="876">
     <w:name w:val="Endnote Text Char"/>
-    <w:basedOn w:val="148"/>
-    <w:link w:val="184"/>
+    <w:basedOn w:val="842"/>
+    <w:link w:val="875"/>
     <w:uiPriority w:val="99"/>
     <w:semiHidden/>
     <w:pPr>
@@ -31415,9 +31716,9 @@
       <w:szCs w:val="20"/>
     </w:rPr>
   </w:style>
-  <w:style w:type="character" w:styleId="186">
+  <w:style w:type="character" w:styleId="877">
     <w:name w:val="endnote reference"/>
-    <w:basedOn w:val="148"/>
+    <w:basedOn w:val="842"/>
     <w:uiPriority w:val="99"/>
     <w:semiHidden/>
     <w:unhideWhenUsed/>
@@ -31430,9 +31731,9 @@
       <w:vertAlign w:val="superscript"/>
     </w:rPr>
   </w:style>
-  <w:style w:type="character" w:styleId="187">
+  <w:style w:type="character" w:styleId="878">
     <w:name w:val="Hyperlink"/>
-    <w:basedOn w:val="148"/>
+    <w:basedOn w:val="842"/>
     <w:uiPriority w:val="99"/>
     <w:unhideWhenUsed/>
     <w:pPr>
@@ -31445,9 +31746,9 @@
       <w:u w:val="single"/>
     </w:rPr>
   </w:style>
-  <w:style w:type="character" w:styleId="188">
+  <w:style w:type="character" w:styleId="879">
     <w:name w:val="FollowedHyperlink"/>
-    <w:basedOn w:val="148"/>
+    <w:basedOn w:val="842"/>
     <w:uiPriority w:val="99"/>
     <w:semiHidden/>
     <w:unhideWhenUsed/>
@@ -31461,10 +31762,10 @@
       <w:u w:val="single"/>
     </w:rPr>
   </w:style>
-  <w:style w:type="paragraph" w:styleId="189">
+  <w:style w:type="paragraph" w:styleId="880">
     <w:name w:val="toc 1"/>
-    <w:basedOn w:val="664"/>
-    <w:next w:val="664"/>
+    <w:basedOn w:val="892"/>
+    <w:next w:val="892"/>
     <w:uiPriority w:val="39"/>
     <w:unhideWhenUsed/>
     <w:pPr>
@@ -31473,10 +31774,10 @@
       <w:ind/>
     </w:pPr>
   </w:style>
-  <w:style w:type="paragraph" w:styleId="190">
+  <w:style w:type="paragraph" w:styleId="881">
     <w:name w:val="toc 2"/>
-    <w:basedOn w:val="664"/>
-    <w:next w:val="664"/>
+    <w:basedOn w:val="892"/>
+    <w:next w:val="892"/>
     <w:uiPriority w:val="39"/>
     <w:unhideWhenUsed/>
     <w:pPr>
@@ -31485,10 +31786,10 @@
       <w:ind w:left="220"/>
     </w:pPr>
   </w:style>
-  <w:style w:type="paragraph" w:styleId="191">
+  <w:style w:type="paragraph" w:styleId="882">
     <w:name w:val="toc 3"/>
-    <w:basedOn w:val="664"/>
-    <w:next w:val="664"/>
+    <w:basedOn w:val="892"/>
+    <w:next w:val="892"/>
     <w:uiPriority w:val="39"/>
     <w:unhideWhenUsed/>
     <w:pPr>
@@ -31497,10 +31798,10 @@
       <w:ind w:left="440"/>
     </w:pPr>
   </w:style>
-  <w:style w:type="paragraph" w:styleId="192">
+  <w:style w:type="paragraph" w:styleId="883">
     <w:name w:val="toc 4"/>
-    <w:basedOn w:val="664"/>
-    <w:next w:val="664"/>
+    <w:basedOn w:val="892"/>
+    <w:next w:val="892"/>
     <w:uiPriority w:val="39"/>
     <w:unhideWhenUsed/>
     <w:pPr>
@@ -31509,10 +31810,10 @@
       <w:ind w:left="660"/>
     </w:pPr>
   </w:style>
-  <w:style w:type="paragraph" w:styleId="193">
+  <w:style w:type="paragraph" w:styleId="884">
     <w:name w:val="toc 5"/>
-    <w:basedOn w:val="664"/>
-    <w:next w:val="664"/>
+    <w:basedOn w:val="892"/>
+    <w:next w:val="892"/>
     <w:uiPriority w:val="39"/>
     <w:unhideWhenUsed/>
     <w:pPr>
@@ -31521,10 +31822,10 @@
       <w:ind w:left="880"/>
     </w:pPr>
   </w:style>
-  <w:style w:type="paragraph" w:styleId="194">
+  <w:style w:type="paragraph" w:styleId="885">
     <w:name w:val="toc 6"/>
-    <w:basedOn w:val="664"/>
-    <w:next w:val="664"/>
+    <w:basedOn w:val="892"/>
+    <w:next w:val="892"/>
     <w:uiPriority w:val="39"/>
     <w:unhideWhenUsed/>
     <w:pPr>
@@ -31533,10 +31834,10 @@
       <w:ind w:left="1100"/>
     </w:pPr>
   </w:style>
-  <w:style w:type="paragraph" w:styleId="195">
+  <w:style w:type="paragraph" w:styleId="886">
     <w:name w:val="toc 7"/>
-    <w:basedOn w:val="664"/>
-    <w:next w:val="664"/>
+    <w:basedOn w:val="892"/>
+    <w:next w:val="892"/>
     <w:uiPriority w:val="39"/>
     <w:unhideWhenUsed/>
     <w:pPr>
@@ -31545,10 +31846,10 @@
       <w:ind w:left="1320"/>
     </w:pPr>
   </w:style>
-  <w:style w:type="paragraph" w:styleId="196">
+  <w:style w:type="paragraph" w:styleId="887">
     <w:name w:val="toc 8"/>
-    <w:basedOn w:val="664"/>
-    <w:next w:val="664"/>
+    <w:basedOn w:val="892"/>
+    <w:next w:val="892"/>
     <w:uiPriority w:val="39"/>
     <w:unhideWhenUsed/>
     <w:pPr>
@@ -31557,10 +31858,10 @@
       <w:ind w:left="1540"/>
     </w:pPr>
   </w:style>
-  <w:style w:type="paragraph" w:styleId="197">
+  <w:style w:type="paragraph" w:styleId="888">
     <w:name w:val="toc 9"/>
-    <w:basedOn w:val="664"/>
-    <w:next w:val="664"/>
+    <w:basedOn w:val="892"/>
+    <w:next w:val="892"/>
     <w:uiPriority w:val="39"/>
     <w:unhideWhenUsed/>
     <w:pPr>
@@ -31569,9 +31870,9 @@
       <w:ind w:left="1760"/>
     </w:pPr>
   </w:style>
-  <w:style w:type="character" w:styleId="198">
+  <w:style w:type="character" w:styleId="889">
     <w:name w:val="Placeholder Text"/>
-    <w:basedOn w:val="148"/>
+    <w:basedOn w:val="842"/>
     <w:uiPriority w:val="99"/>
     <w:semiHidden/>
     <w:pPr>
@@ -31583,7 +31884,7 @@
       <w:color w:val="666666"/>
     </w:rPr>
   </w:style>
-  <w:style w:type="paragraph" w:styleId="208">
+  <w:style w:type="paragraph" w:styleId="890">
     <w:name w:val="TOC Heading"/>
     <w:uiPriority w:val="39"/>
     <w:unhideWhenUsed/>
@@ -31593,10 +31894,10 @@
       <w:ind/>
     </w:pPr>
   </w:style>
-  <w:style w:type="paragraph" w:styleId="209">
+  <w:style w:type="paragraph" w:styleId="891">
     <w:name w:val="table of figures"/>
-    <w:basedOn w:val="664"/>
-    <w:next w:val="664"/>
+    <w:basedOn w:val="892"/>
+    <w:next w:val="892"/>
     <w:uiPriority w:val="99"/>
     <w:unhideWhenUsed/>
     <w:pPr>
@@ -31605,7 +31906,7 @@
       <w:ind/>
     </w:pPr>
   </w:style>
-  <w:style w:type="paragraph" w:styleId="664" w:default="1">
+  <w:style w:type="paragraph" w:styleId="892" w:default="1">
     <w:name w:val="Normal"/>
     <w:qFormat/>
     <w:pPr>
@@ -31614,7 +31915,7 @@
       <w:ind/>
     </w:pPr>
   </w:style>
-  <w:style w:type="table" w:styleId="665" w:default="1">
+  <w:style w:type="table" w:styleId="893" w:default="1">
     <w:name w:val="Normal Table"/>
     <w:uiPriority w:val="99"/>
     <w:semiHidden/>
@@ -31807,7 +32108,7 @@
       </w:tcPr>
     </w:tblStylePr>
   </w:style>
-  <w:style w:type="numbering" w:styleId="666" w:default="1">
+  <w:style w:type="numbering" w:styleId="894" w:default="1">
     <w:name w:val="No List"/>
     <w:uiPriority w:val="99"/>
     <w:semiHidden/>
@@ -31818,9 +32119,9 @@
       <w:ind/>
     </w:pPr>
   </w:style>
-  <w:style w:type="paragraph" w:styleId="667">
+  <w:style w:type="paragraph" w:styleId="895">
     <w:name w:val="No Spacing"/>
-    <w:basedOn w:val="664"/>
+    <w:basedOn w:val="892"/>
     <w:uiPriority w:val="1"/>
     <w:qFormat/>
     <w:pPr>
@@ -31829,9 +32130,9 @@
       <w:ind/>
     </w:pPr>
   </w:style>
-  <w:style w:type="paragraph" w:styleId="668">
+  <w:style w:type="paragraph" w:styleId="896">
     <w:name w:val="List Paragraph"/>
-    <w:basedOn w:val="664"/>
+    <w:basedOn w:val="892"/>
     <w:uiPriority w:val="34"/>
     <w:qFormat/>
     <w:pPr>
@@ -31841,9 +32142,8 @@
       <w:contextualSpacing w:val="true"/>
     </w:pPr>
   </w:style>
-  <w:style w:type="paragraph" w:styleId="1_18" w:customStyle="1">
+  <w:style w:type="paragraph" w:styleId="897" w:customStyle="1">
     <w:name w:val="Table Contents"/>
-    <w:basedOn w:val="739"/>
     <w:qFormat/>
     <w:pPr>
       <w:keepNext w:val="false"/>
@@ -31858,7 +32158,7 @@
         <w:right w:val="none" w:color="000000" w:sz="4" w:space="0"/>
         <w:between w:val="none" w:color="000000" w:sz="4" w:space="0"/>
       </w:pBdr>
-      <w:shd w:val="nil" w:color="000000"/>
+      <w:shd w:val="nil"/>
       <w:bidi w:val="false"/>
       <w:spacing w:after="0" w:afterAutospacing="0" w:before="0" w:beforeAutospacing="0" w:line="240" w:lineRule="auto"/>
       <w:ind w:right="0" w:firstLine="0" w:left="0"/>

</xml_diff>